<commit_message>
Updated licence to publish
</commit_message>
<xml_diff>
--- a/assets/downloads/proceedings/springer-licence-to-publish-form.docx
+++ b/assets/downloads/proceedings/springer-licence-to-publish-form.docx
@@ -1,10 +1,10 @@
 
 <file path=word/document.xml><?xml version="1.0" encoding="utf-8"?>
-<w:document xmlns:wpc="http://schemas.microsoft.com/office/word/2010/wordprocessingCanvas" xmlns:cx="http://schemas.microsoft.com/office/drawing/2014/chartex" xmlns:cx1="http://schemas.microsoft.com/office/drawing/2015/9/8/chartex" xmlns:cx2="http://schemas.microsoft.com/office/drawing/2015/10/21/chartex" xmlns:cx3="http://schemas.microsoft.com/office/drawing/2016/5/9/chartex" xmlns:cx4="http://schemas.microsoft.com/office/drawing/2016/5/10/chartex" xmlns:cx5="http://schemas.microsoft.com/office/drawing/2016/5/11/chartex" xmlns:cx6="http://schemas.microsoft.com/office/drawing/2016/5/12/chartex" xmlns:cx7="http://schemas.microsoft.com/office/drawing/2016/5/13/chartex" xmlns:cx8="http://schemas.microsoft.com/office/drawing/2016/5/14/chartex" xmlns:mc="http://schemas.openxmlformats.org/markup-compatibility/2006" xmlns:aink="http://schemas.microsoft.com/office/drawing/2016/ink" xmlns:am3d="http://schemas.microsoft.com/office/drawing/2017/model3d" xmlns:o="urn:schemas-microsoft-com:office:office" xmlns:oel="http://schemas.microsoft.com/office/2019/extlst" xmlns:r="http://schemas.openxmlformats.org/officeDocument/2006/relationships" xmlns:m="http://schemas.openxmlformats.org/officeDocument/2006/math" xmlns:v="urn:schemas-microsoft-com:vml" xmlns:wp14="http://schemas.microsoft.com/office/word/2010/wordprocessingDrawing" xmlns:wp="http://schemas.openxmlformats.org/drawingml/2006/wordprocessingDrawing" xmlns:w10="urn:schemas-microsoft-com:office:word" xmlns:w="http://schemas.openxmlformats.org/wordprocessingml/2006/main" xmlns:w14="http://schemas.microsoft.com/office/word/2010/wordml" xmlns:w15="http://schemas.microsoft.com/office/word/2012/wordml" xmlns:w16cex="http://schemas.microsoft.com/office/word/2018/wordml/cex" xmlns:w16cid="http://schemas.microsoft.com/office/word/2016/wordml/cid" xmlns:w16="http://schemas.microsoft.com/office/word/2018/wordml" xmlns:w16du="http://schemas.microsoft.com/office/word/2023/wordml/word16du" xmlns:w16sdtdh="http://schemas.microsoft.com/office/word/2020/wordml/sdtdatahash" xmlns:w16sdtfl="http://schemas.microsoft.com/office/word/2024/wordml/sdtformatlock" xmlns:w16se="http://schemas.microsoft.com/office/word/2015/wordml/symex" xmlns:wpg="http://schemas.microsoft.com/office/word/2010/wordprocessingGroup" xmlns:wpi="http://schemas.microsoft.com/office/word/2010/wordprocessingInk" xmlns:wne="http://schemas.microsoft.com/office/word/2006/wordml" xmlns:wps="http://schemas.microsoft.com/office/word/2010/wordprocessingShape" mc:Ignorable="w14 w15 w16se w16cid w16 w16cex w16sdtdh w16sdtfl w16du wp14">
+<w:document xmlns:wpc="http://schemas.microsoft.com/office/word/2010/wordprocessingCanvas" xmlns:cx="http://schemas.microsoft.com/office/drawing/2014/chartex" xmlns:cx1="http://schemas.microsoft.com/office/drawing/2015/9/8/chartex" xmlns:cx2="http://schemas.microsoft.com/office/drawing/2015/10/21/chartex" xmlns:cx3="http://schemas.microsoft.com/office/drawing/2016/5/9/chartex" xmlns:cx4="http://schemas.microsoft.com/office/drawing/2016/5/10/chartex" xmlns:cx5="http://schemas.microsoft.com/office/drawing/2016/5/11/chartex" xmlns:cx6="http://schemas.microsoft.com/office/drawing/2016/5/12/chartex" xmlns:cx7="http://schemas.microsoft.com/office/drawing/2016/5/13/chartex" xmlns:cx8="http://schemas.microsoft.com/office/drawing/2016/5/14/chartex" xmlns:mc="http://schemas.openxmlformats.org/markup-compatibility/2006" xmlns:m="http://schemas.openxmlformats.org/officeDocument/2006/math" xmlns:aink="http://schemas.microsoft.com/office/drawing/2016/ink" xmlns:am3d="http://schemas.microsoft.com/office/drawing/2017/model3d" xmlns:oel="http://schemas.microsoft.com/office/2019/extlst" xmlns:r="http://schemas.openxmlformats.org/officeDocument/2006/relationships" xmlns:wp14="http://schemas.microsoft.com/office/word/2010/wordprocessingDrawing" xmlns:wp="http://schemas.openxmlformats.org/drawingml/2006/wordprocessingDrawing" xmlns:wpg="http://schemas.microsoft.com/office/word/2010/wordprocessingGroup" xmlns:wpi="http://schemas.microsoft.com/office/word/2010/wordprocessingInk" xmlns:wps="http://schemas.microsoft.com/office/word/2010/wordprocessingShape" xmlns:o="urn:schemas-microsoft-com:office:office" xmlns:v="urn:schemas-microsoft-com:vml" xmlns:w10="urn:schemas-microsoft-com:office:word" xmlns:w="http://schemas.openxmlformats.org/wordprocessingml/2006/main" xmlns:w14="http://schemas.microsoft.com/office/word/2010/wordml" xmlns:w15="http://schemas.microsoft.com/office/word/2012/wordml" xmlns:w16cex="http://schemas.microsoft.com/office/word/2018/wordml/cex" xmlns:w16cid="http://schemas.microsoft.com/office/word/2016/wordml/cid" xmlns:w16="http://schemas.microsoft.com/office/word/2018/wordml" xmlns:w16sdtdh="http://schemas.microsoft.com/office/word/2020/wordml/sdtdatahash" xmlns:w16sdtfl="http://schemas.microsoft.com/office/word/2024/wordml/sdtformatlock" xmlns:w16se="http://schemas.microsoft.com/office/word/2015/wordml/symex" xmlns:w16du="http://schemas.microsoft.com/office/word/2023/wordml/word16du" xmlns:wne="http://schemas.microsoft.com/office/word/2006/wordml" mc:Ignorable="w14 w15 w16se w16cid w16 w16cex w16sdtdh w16sdtfl w16du wp14">
   <w:body>
     <w:tbl>
       <w:tblPr>
-        <w:tblStyle w:val="Tabellenraster"/>
+        <w:tblStyle w:val="TableGrid"/>
         <w:tblW w:w="0" w:type="auto"/>
         <w:tblBorders>
           <w:top w:val="none" w:sz="0" w:space="0" w:color="auto"/>
@@ -29,7 +29,7 @@
           </w:tcPr>
           <w:p>
             <w:pPr>
-              <w:pStyle w:val="Titel"/>
+              <w:pStyle w:val="Title"/>
             </w:pPr>
             <w:r>
               <w:t>Licence to Publish</w:t>
@@ -349,7 +349,6 @@
             <w:placeholder>
               <w:docPart w:val="6A8A996FEC314FAEBC0A8320051A9866"/>
             </w:placeholder>
-            <w:showingPlcHdr/>
           </w:sdtPr>
           <w:sdtContent>
             <w:tc>
@@ -369,9 +368,8 @@
                     <w:rFonts w:eastAsia="Cambria" w:cstheme="minorHAnsi"/>
                     <w:sz w:val="16"/>
                     <w:szCs w:val="16"/>
-                    <w:highlight w:val="lightGray"/>
                   </w:rPr>
-                  <w:t>Click here to enter text.</w:t>
+                  <w:t>MICCAI 2026</w:t>
                 </w:r>
               </w:p>
             </w:tc>
@@ -497,32 +495,65 @@
             <w:placeholder>
               <w:docPart w:val="D396DE6BAAE04F078FD6EECA6106629A"/>
             </w:placeholder>
-            <w:showingPlcHdr/>
           </w:sdtPr>
           <w:sdtContent>
-            <w:tc>
-              <w:tcPr>
-                <w:tcW w:w="2394" w:type="pct"/>
-              </w:tcPr>
-              <w:p>
-                <w:pPr>
-                  <w:rPr>
-                    <w:rFonts w:eastAsia="Cambria" w:cstheme="minorHAnsi"/>
-                    <w:sz w:val="16"/>
-                    <w:szCs w:val="16"/>
-                  </w:rPr>
-                </w:pPr>
-                <w:r>
-                  <w:rPr>
-                    <w:rFonts w:eastAsia="Cambria" w:cstheme="minorHAnsi"/>
-                    <w:sz w:val="16"/>
-                    <w:szCs w:val="16"/>
-                    <w:highlight w:val="lightGray"/>
-                  </w:rPr>
-                  <w:t>Click here to enter text.</w:t>
-                </w:r>
-              </w:p>
-            </w:tc>
+            <w:sdt>
+              <w:sdtPr>
+                <w:rPr>
+                  <w:rFonts w:eastAsia="Cambria" w:cstheme="minorHAnsi"/>
+                  <w:sz w:val="16"/>
+                  <w:szCs w:val="16"/>
+                </w:rPr>
+                <w:alias w:val="Volume Editor Name"/>
+                <w:tag w:val="Volume Editor Name"/>
+                <w:id w:val="227041270"/>
+                <w:placeholder>
+                  <w:docPart w:val="D4B64FC99ADFBB419A2DDC634B72360A"/>
+                </w:placeholder>
+              </w:sdtPr>
+              <w:sdtEndPr/>
+              <w:sdtContent>
+                <w:tc>
+                  <w:tcPr>
+                    <w:tcW w:w="2394" w:type="pct"/>
+                  </w:tcPr>
+                  <w:p>
+                    <w:pPr>
+                      <w:rPr>
+                        <w:rFonts w:eastAsia="Cambria" w:cstheme="minorHAnsi"/>
+                        <w:sz w:val="16"/>
+                        <w:szCs w:val="16"/>
+                      </w:rPr>
+                    </w:pPr>
+                    <w:r>
+                      <w:rPr>
+                        <w:rFonts w:eastAsia="Cambria" w:cstheme="minorHAnsi"/>
+                        <w:sz w:val="16"/>
+                        <w:szCs w:val="16"/>
+                      </w:rPr>
+                      <w:t>Jana G. Delfino</w:t>
+                    </w:r>
+                  </w:p>
+                  <w:p>
+                    <w:pPr>
+                      <w:rPr>
+                        <w:rFonts w:eastAsia="Cambria" w:cstheme="minorHAnsi"/>
+                        <w:sz w:val="16"/>
+                        <w:szCs w:val="16"/>
+                      </w:rPr>
+                    </w:pPr>
+                    <w:r>
+                      <w:rPr>
+                        <w:rFonts w:eastAsia="Cambria" w:cstheme="minorHAnsi"/>
+                        <w:sz w:val="16"/>
+                        <w:szCs w:val="16"/>
+                      </w:rPr>
+                      <w:t>Florence X. Doo</w:t>
+                    </w:r>
+                  </w:p>
+                </w:tc>
+              </w:sdtContent>
+            </w:sdt>
           </w:sdtContent>
         </w:sdt>
         <w:tc>
@@ -768,42 +799,57 @@
             <w:tcW w:w="2394" w:type="pct"/>
             <w:vAlign w:val="center"/>
           </w:tcPr>
-          <w:p>
-            <w:pPr>
+          <w:sdt>
+            <w:sdtPr>
               <w:rPr>
                 <w:rFonts w:eastAsia="Cambria" w:cstheme="minorHAnsi"/>
                 <w:sz w:val="16"/>
                 <w:szCs w:val="16"/>
               </w:rPr>
-            </w:pPr>
-            <w:sdt>
-              <w:sdtPr>
-                <w:rPr>
-                  <w:rFonts w:eastAsia="Cambria" w:cstheme="minorHAnsi"/>
-                  <w:sz w:val="16"/>
-                  <w:szCs w:val="16"/>
-                </w:rPr>
-                <w:alias w:val="Series"/>
-                <w:tag w:val="Series"/>
-                <w:id w:val="189277873"/>
-                <w:placeholder>
-                  <w:docPart w:val="22A007FA09B0416FAE2AB143EF3D80A9"/>
-                </w:placeholder>
-                <w:showingPlcHdr/>
-              </w:sdtPr>
-              <w:sdtContent>
-                <w:r>
+              <w:alias w:val="Series"/>
+              <w:tag w:val="Series"/>
+              <w:id w:val="189277873"/>
+              <w:placeholder>
+                <w:docPart w:val="22A007FA09B0416FAE2AB143EF3D80A9"/>
+              </w:placeholder>
+            </w:sdtPr>
+            <w:sdtContent>
+              <w:sdt>
+                <w:sdtPr>
                   <w:rPr>
-                    <w:rFonts w:ascii="Tahoma" w:eastAsia="Cambria" w:hAnsi="Tahoma" w:cs="Tahoma"/>
-                    <w:sz w:val="14"/>
-                    <w:szCs w:val="14"/>
-                    <w:highlight w:val="lightGray"/>
+                    <w:rFonts w:eastAsia="Cambria" w:cstheme="minorHAnsi"/>
+                    <w:sz w:val="16"/>
+                    <w:szCs w:val="16"/>
                   </w:rPr>
-                  <w:t>Click here to enter text.</w:t>
-                </w:r>
-              </w:sdtContent>
-            </w:sdt>
-          </w:p>
+                  <w:alias w:val="Series"/>
+                  <w:tag w:val="Series"/>
+                  <w:id w:val="397566638"/>
+                  <w:placeholder>
+                    <w:docPart w:val="5B6B9D38A2F0BD47955FD4A8C8E9BEBD"/>
+                  </w:placeholder>
+                </w:sdtPr>
+                <w:sdtContent>
+                  <w:p>
+                    <w:pPr>
+                      <w:rPr>
+                        <w:rFonts w:eastAsia="Cambria" w:cstheme="minorHAnsi"/>
+                        <w:sz w:val="16"/>
+                        <w:szCs w:val="16"/>
+                      </w:rPr>
+                    </w:pPr>
+                    <w:r>
+                      <w:rPr>
+                        <w:rFonts w:eastAsia="Cambria" w:cstheme="minorHAnsi"/>
+                        <w:sz w:val="16"/>
+                        <w:szCs w:val="16"/>
+                      </w:rPr>
+                      <w:t>Lecture Notes in Computer Science</w:t>
+                    </w:r>
+                  </w:p>
+                </w:sdtContent>
+              </w:sdt>
+            </w:sdtContent>
+          </w:sdt>
         </w:tc>
         <w:tc>
           <w:tcPr>
@@ -1339,7 +1385,7 @@
     </w:p>
     <w:p>
       <w:pPr>
-        <w:pStyle w:val="berschrift1"/>
+        <w:pStyle w:val="Heading1"/>
       </w:pPr>
       <w:r>
         <w:t>Grant of Rights</w:t>
@@ -1810,7 +1856,7 @@
           <w:szCs w:val="20"/>
           <w:lang w:val="en-US" w:eastAsia="en-GB"/>
         </w:rPr>
-        <w:t>into other media formats, including text-to-speech, speech-to-text, text-to-video, e-learning, podcasts and webcasts;</w:t>
+        <w:t xml:space="preserve">into other media formats, including text-to-speech, </w:t>
       </w:r>
       <w:r>
         <w:rPr>
@@ -1820,17 +1866,18 @@
           <w:szCs w:val="20"/>
           <w:lang w:val="en-US" w:eastAsia="en-GB"/>
         </w:rPr>
+        <w:lastRenderedPageBreak/>
+        <w:t>speech-to-text, text-to-video, e-learning, podcasts and webcasts;</w:t>
+      </w:r>
+      <w:r>
+        <w:rPr>
+          <w:rFonts w:eastAsia="Arial" w:cstheme="minorHAnsi"/>
+          <w:bCs/>
+          <w:sz w:val="20"/>
+          <w:szCs w:val="20"/>
+          <w:lang w:val="en-US" w:eastAsia="en-GB"/>
+        </w:rPr>
         <w:br/>
-      </w:r>
-      <w:r>
-        <w:rPr>
-          <w:rFonts w:eastAsia="Arial" w:cstheme="minorHAnsi"/>
-          <w:bCs/>
-          <w:sz w:val="20"/>
-          <w:szCs w:val="20"/>
-          <w:lang w:val="en-US" w:eastAsia="en-GB"/>
-        </w:rPr>
-        <w:lastRenderedPageBreak/>
         <w:t>(x) the right to use the</w:t>
       </w:r>
       <w:r>
@@ -2161,7 +2208,29 @@
           <w:szCs w:val="20"/>
           <w:lang w:eastAsia="en-GB"/>
         </w:rPr>
-        <w:t xml:space="preserve">(save for those set out in sub-clauses 1.a)(x)-(xii) and, insofar as it relates to those sub-clauses, (xiii)) </w:t>
+        <w:t xml:space="preserve">(save for those set out in sub-clauses </w:t>
+      </w:r>
+      <w:proofErr w:type="gramStart"/>
+      <w:r>
+        <w:rPr>
+          <w:rFonts w:eastAsia="Arial" w:cstheme="minorHAnsi"/>
+          <w:bCs/>
+          <w:sz w:val="20"/>
+          <w:szCs w:val="20"/>
+          <w:lang w:eastAsia="en-GB"/>
+        </w:rPr>
+        <w:t>1.a)(</w:t>
+      </w:r>
+      <w:proofErr w:type="gramEnd"/>
+      <w:r>
+        <w:rPr>
+          <w:rFonts w:eastAsia="Arial" w:cstheme="minorHAnsi"/>
+          <w:bCs/>
+          <w:sz w:val="20"/>
+          <w:szCs w:val="20"/>
+          <w:lang w:eastAsia="en-GB"/>
+        </w:rPr>
+        <w:t xml:space="preserve">x)-(xii) and, insofar as it relates to those sub-clauses, (xiii)) </w:t>
       </w:r>
       <w:r>
         <w:rPr>
@@ -2205,7 +2274,7 @@
     </w:p>
     <w:p>
       <w:pPr>
-        <w:pStyle w:val="berschrift1"/>
+        <w:pStyle w:val="Heading1"/>
       </w:pPr>
       <w:r>
         <w:t>Copyright</w:t>
@@ -2296,7 +2365,7 @@
     </w:p>
     <w:p>
       <w:pPr>
-        <w:pStyle w:val="berschrift1"/>
+        <w:pStyle w:val="Heading1"/>
       </w:pPr>
       <w:r>
         <w:t>Accessibility</w:t>
@@ -2387,7 +2456,7 @@
     </w:p>
     <w:p>
       <w:pPr>
-        <w:pStyle w:val="berschrift1"/>
+        <w:pStyle w:val="Heading1"/>
       </w:pPr>
       <w:r>
         <w:t>Use of Contribution Versions</w:t>
@@ -2494,6 +2563,7 @@
           <w:id w:val="1461126527"/>
         </w:sdtPr>
         <w:sdtContent>
+          <w:proofErr w:type="spellStart"/>
           <w:r>
             <w:rPr>
               <w:rFonts w:eastAsia="Arial" w:cstheme="minorHAnsi"/>
@@ -2504,6 +2574,7 @@
             </w:rPr>
             <w:t>Author</w:t>
           </w:r>
+          <w:proofErr w:type="spellEnd"/>
         </w:sdtContent>
       </w:sdt>
       <w:r>
@@ -2543,7 +2614,7 @@
           <w:szCs w:val="20"/>
           <w:lang w:eastAsia="en-GB"/>
         </w:rPr>
-        <w:t xml:space="preserve"> will include an acknowledgement and provide a link to the Version of Record on the publisher’s website: “This preprint has not undergone peer review </w:t>
+        <w:t xml:space="preserve"> will include an acknowledgement and provide a link to </w:t>
       </w:r>
       <w:r>
         <w:rPr>
@@ -2554,7 +2625,51 @@
           <w:lang w:eastAsia="en-GB"/>
         </w:rPr>
         <w:lastRenderedPageBreak/>
-        <w:t>(when applicable) or any post-submission improvements or corrections. The Version of Record of this contribution is published in [insert volume title], and is available online at https://doi.org/[insert DOI]”.</w:t>
+        <w:t>the Version of Record on the publisher’s website: “This preprint has not undergone peer review (when applicable) or any post-submission improvements or corrections. The Version of Record of this contribution is published in [insert volume title</w:t>
+      </w:r>
+      <w:proofErr w:type="gramStart"/>
+      <w:r>
+        <w:rPr>
+          <w:rFonts w:eastAsia="Arial" w:cstheme="minorHAnsi"/>
+          <w:bCs/>
+          <w:sz w:val="20"/>
+          <w:szCs w:val="20"/>
+          <w:lang w:eastAsia="en-GB"/>
+        </w:rPr>
+        <w:t>], and</w:t>
+      </w:r>
+      <w:proofErr w:type="gramEnd"/>
+      <w:r>
+        <w:rPr>
+          <w:rFonts w:eastAsia="Arial" w:cstheme="minorHAnsi"/>
+          <w:bCs/>
+          <w:sz w:val="20"/>
+          <w:szCs w:val="20"/>
+          <w:lang w:eastAsia="en-GB"/>
+        </w:rPr>
+        <w:t xml:space="preserve"> is available online at </w:t>
+      </w:r>
+      <w:proofErr w:type="gramStart"/>
+      <w:r>
+        <w:rPr>
+          <w:rFonts w:eastAsia="Arial" w:cstheme="minorHAnsi"/>
+          <w:bCs/>
+          <w:sz w:val="20"/>
+          <w:szCs w:val="20"/>
+          <w:lang w:eastAsia="en-GB"/>
+        </w:rPr>
+        <w:t>https://doi.org/[</w:t>
+      </w:r>
+      <w:proofErr w:type="gramEnd"/>
+      <w:r>
+        <w:rPr>
+          <w:rFonts w:eastAsia="Arial" w:cstheme="minorHAnsi"/>
+          <w:bCs/>
+          <w:sz w:val="20"/>
+          <w:szCs w:val="20"/>
+          <w:lang w:eastAsia="en-GB"/>
+        </w:rPr>
+        <w:t>insert DOI]”.</w:t>
       </w:r>
     </w:p>
     <w:p>
@@ -2699,6 +2814,7 @@
           <w:id w:val="1545959259"/>
         </w:sdtPr>
         <w:sdtContent>
+          <w:proofErr w:type="spellStart"/>
           <w:r>
             <w:rPr>
               <w:rFonts w:eastAsia="Arial" w:cstheme="minorHAnsi"/>
@@ -2709,6 +2825,7 @@
             </w:rPr>
             <w:t>Author</w:t>
           </w:r>
+          <w:proofErr w:type="spellEnd"/>
         </w:sdtContent>
       </w:sdt>
       <w:r>
@@ -2719,7 +2836,29 @@
           <w:szCs w:val="20"/>
           <w:lang w:eastAsia="en-GB"/>
         </w:rPr>
-        <w:t xml:space="preserve"> includes on the Accepted Manuscript an acknowledgement in the following form, together with a link to the published version on the publisher’s website: “This version of the contribution has been accepted for publication, after peer review (when applicable) but is not the Version of Record and does not reflect post-acceptance improvements, or any corrections. The Version of Record is available online at: http://dx.doi.org/[insert DOI]. Use of this Accepted Version is subject to the publisher’s Accepted Manuscript terms of use </w:t>
+        <w:t xml:space="preserve"> includes on the Accepted Manuscript an acknowledgement in the following form, together with a link to the published version on the publisher’s website: “This version of the contribution has been accepted for publication, after peer review (when applicable) but is not the Version of Record and does not reflect post-acceptance improvements, or any corrections. The Version of Record is available online at: </w:t>
+      </w:r>
+      <w:proofErr w:type="gramStart"/>
+      <w:r>
+        <w:rPr>
+          <w:rFonts w:eastAsia="Arial" w:cstheme="minorHAnsi"/>
+          <w:bCs/>
+          <w:sz w:val="20"/>
+          <w:szCs w:val="20"/>
+          <w:lang w:eastAsia="en-GB"/>
+        </w:rPr>
+        <w:t>http://dx.doi.org/[</w:t>
+      </w:r>
+      <w:proofErr w:type="gramEnd"/>
+      <w:r>
+        <w:rPr>
+          <w:rFonts w:eastAsia="Arial" w:cstheme="minorHAnsi"/>
+          <w:bCs/>
+          <w:sz w:val="20"/>
+          <w:szCs w:val="20"/>
+          <w:lang w:eastAsia="en-GB"/>
+        </w:rPr>
+        <w:t xml:space="preserve">insert DOI]. Use of this Accepted Version is subject to the publisher’s Accepted Manuscript terms of use </w:t>
       </w:r>
       <w:hyperlink r:id="rId14" w:history="1">
         <w:r>
@@ -2819,6 +2958,7 @@
           <w:id w:val="793432970"/>
         </w:sdtPr>
         <w:sdtContent>
+          <w:proofErr w:type="spellStart"/>
           <w:r>
             <w:rPr>
               <w:rFonts w:eastAsia="Arial" w:cstheme="minorHAnsi"/>
@@ -2829,6 +2969,7 @@
             </w:rPr>
             <w:t>Author</w:t>
           </w:r>
+          <w:proofErr w:type="spellEnd"/>
         </w:sdtContent>
       </w:sdt>
       <w:r>
@@ -3057,7 +3198,7 @@
           <w:szCs w:val="20"/>
           <w:lang w:eastAsia="en-GB"/>
         </w:rPr>
-        <w:t xml:space="preserve">to publish an expanded version of their Contribution provided the expanded version (i) includes at least 30% new material (ii) includes an express statement specifying the </w:t>
+        <w:t xml:space="preserve">to publish an expanded version of their Contribution provided the expanded version (i) </w:t>
       </w:r>
       <w:r>
         <w:rPr>
@@ -3068,12 +3209,12 @@
           <w:lang w:eastAsia="en-GB"/>
         </w:rPr>
         <w:lastRenderedPageBreak/>
-        <w:t>incremental change in the expanded version (e.g., new results, better description of materials, etc.).</w:t>
+        <w:t>includes at least 30% new material (ii) includes an express statement specifying the incremental change in the expanded version (e.g., new results, better description of materials, etc.).</w:t>
       </w:r>
     </w:p>
     <w:p>
       <w:pPr>
-        <w:pStyle w:val="berschrift1"/>
+        <w:pStyle w:val="Heading1"/>
       </w:pPr>
       <w:r>
         <w:t>Warranties &amp; Representations</w:t>
@@ -3233,7 +3374,51 @@
           <w:szCs w:val="20"/>
           <w:lang w:eastAsia="en-GB"/>
         </w:rPr>
-        <w:t>the Contribution does not infringe any intellectual property rights (including without limitation copyright, database rights or trade mark rights) or other third party rights and no licence from or payments to a third party are required to publish the Contribution,</w:t>
+        <w:t xml:space="preserve">the Contribution does not infringe any intellectual property rights (including without limitation copyright, database rights or </w:t>
+      </w:r>
+      <w:proofErr w:type="gramStart"/>
+      <w:r>
+        <w:rPr>
+          <w:rFonts w:eastAsia="Arial" w:cstheme="minorHAnsi"/>
+          <w:bCs/>
+          <w:sz w:val="20"/>
+          <w:szCs w:val="20"/>
+          <w:lang w:eastAsia="en-GB"/>
+        </w:rPr>
+        <w:t>trade mark</w:t>
+      </w:r>
+      <w:proofErr w:type="gramEnd"/>
+      <w:r>
+        <w:rPr>
+          <w:rFonts w:eastAsia="Arial" w:cstheme="minorHAnsi"/>
+          <w:bCs/>
+          <w:sz w:val="20"/>
+          <w:szCs w:val="20"/>
+          <w:lang w:eastAsia="en-GB"/>
+        </w:rPr>
+        <w:t xml:space="preserve"> rights) or other </w:t>
+      </w:r>
+      <w:proofErr w:type="gramStart"/>
+      <w:r>
+        <w:rPr>
+          <w:rFonts w:eastAsia="Arial" w:cstheme="minorHAnsi"/>
+          <w:bCs/>
+          <w:sz w:val="20"/>
+          <w:szCs w:val="20"/>
+          <w:lang w:eastAsia="en-GB"/>
+        </w:rPr>
+        <w:t>third party</w:t>
+      </w:r>
+      <w:proofErr w:type="gramEnd"/>
+      <w:r>
+        <w:rPr>
+          <w:rFonts w:eastAsia="Arial" w:cstheme="minorHAnsi"/>
+          <w:bCs/>
+          <w:sz w:val="20"/>
+          <w:szCs w:val="20"/>
+          <w:lang w:eastAsia="en-GB"/>
+        </w:rPr>
+        <w:t xml:space="preserve"> rights and no licence from or payments to a third party are required to publish the Contribution,</w:t>
       </w:r>
     </w:p>
     <w:p>
@@ -3387,15 +3572,27 @@
           <w:lang w:eastAsia="en-GB"/>
         </w:rPr>
       </w:pPr>
-      <w:r>
-        <w:rPr>
-          <w:rFonts w:eastAsia="Arial" w:cstheme="minorHAnsi"/>
-          <w:bCs/>
-          <w:sz w:val="20"/>
-          <w:szCs w:val="20"/>
-          <w:lang w:eastAsia="en-GB"/>
-        </w:rPr>
-        <w:t xml:space="preserve">all of the facts contained in the Contribution are according to the current body of research true and accurate; </w:t>
+      <w:proofErr w:type="gramStart"/>
+      <w:r>
+        <w:rPr>
+          <w:rFonts w:eastAsia="Arial" w:cstheme="minorHAnsi"/>
+          <w:bCs/>
+          <w:sz w:val="20"/>
+          <w:szCs w:val="20"/>
+          <w:lang w:eastAsia="en-GB"/>
+        </w:rPr>
+        <w:t>all of</w:t>
+      </w:r>
+      <w:proofErr w:type="gramEnd"/>
+      <w:r>
+        <w:rPr>
+          <w:rFonts w:eastAsia="Arial" w:cstheme="minorHAnsi"/>
+          <w:bCs/>
+          <w:sz w:val="20"/>
+          <w:szCs w:val="20"/>
+          <w:lang w:eastAsia="en-GB"/>
+        </w:rPr>
+        <w:t xml:space="preserve"> the facts contained in the Contribution are according to the current body of research true and accurate; </w:t>
       </w:r>
     </w:p>
     <w:p>
@@ -3593,7 +3790,29 @@
           <w:szCs w:val="20"/>
           <w:lang w:eastAsia="en-GB"/>
         </w:rPr>
-        <w:t>the signatory who has signed this Agreement has full right, power and authority to enter into this Agreement on behalf of all of the Authors; and</w:t>
+        <w:t xml:space="preserve">the signatory who has signed this Agreement has full right, power and authority to enter into this Agreement on behalf of </w:t>
+      </w:r>
+      <w:proofErr w:type="gramStart"/>
+      <w:r>
+        <w:rPr>
+          <w:rFonts w:eastAsia="Arial" w:cstheme="minorHAnsi"/>
+          <w:bCs/>
+          <w:sz w:val="20"/>
+          <w:szCs w:val="20"/>
+          <w:lang w:eastAsia="en-GB"/>
+        </w:rPr>
+        <w:t>all of</w:t>
+      </w:r>
+      <w:proofErr w:type="gramEnd"/>
+      <w:r>
+        <w:rPr>
+          <w:rFonts w:eastAsia="Arial" w:cstheme="minorHAnsi"/>
+          <w:bCs/>
+          <w:sz w:val="20"/>
+          <w:szCs w:val="20"/>
+          <w:lang w:eastAsia="en-GB"/>
+        </w:rPr>
+        <w:t xml:space="preserve"> the Authors; and</w:t>
       </w:r>
     </w:p>
     <w:p>
@@ -3650,7 +3869,29 @@
           <w:szCs w:val="20"/>
           <w:lang w:eastAsia="en-GB"/>
         </w:rPr>
-        <w:t xml:space="preserve"> complies in full with: i. all instructions and policies in the Instructions for Authors, ii. the Licensee’s ethics rules (available at </w:t>
+        <w:t xml:space="preserve"> complies in full </w:t>
+      </w:r>
+      <w:proofErr w:type="gramStart"/>
+      <w:r>
+        <w:rPr>
+          <w:rFonts w:eastAsia="Arial" w:cstheme="minorHAnsi"/>
+          <w:bCs/>
+          <w:sz w:val="20"/>
+          <w:szCs w:val="20"/>
+          <w:lang w:eastAsia="en-GB"/>
+        </w:rPr>
+        <w:t>with:</w:t>
+      </w:r>
+      <w:proofErr w:type="gramEnd"/>
+      <w:r>
+        <w:rPr>
+          <w:rFonts w:eastAsia="Arial" w:cstheme="minorHAnsi"/>
+          <w:bCs/>
+          <w:sz w:val="20"/>
+          <w:szCs w:val="20"/>
+          <w:lang w:eastAsia="en-GB"/>
+        </w:rPr>
+        <w:t xml:space="preserve"> i. all instructions and policies in the Instructions for Authors, ii. the Licensee’s ethics rules (available at </w:t>
       </w:r>
       <w:hyperlink r:id="rId15" w:history="1">
         <w:r>
@@ -3662,7 +3903,19 @@
             <w:szCs w:val="20"/>
             <w:lang w:eastAsia="en-GB"/>
           </w:rPr>
-          <w:t>https://www.springernature.com/gp/authors/book-authors-code-of-conduct</w:t>
+          <w:t>https://www.springernature.com/gp/authors/book-authors-</w:t>
+        </w:r>
+        <w:r>
+          <w:rPr>
+            <w:rStyle w:val="Hyperlink"/>
+            <w:rFonts w:eastAsia="Arial" w:cstheme="minorHAnsi"/>
+            <w:bCs/>
+            <w:sz w:val="20"/>
+            <w:szCs w:val="20"/>
+            <w:lang w:eastAsia="en-GB"/>
+          </w:rPr>
+          <w:lastRenderedPageBreak/>
+          <w:t>code-of-conduct</w:t>
         </w:r>
       </w:hyperlink>
       <w:r>
@@ -3678,7 +3931,7 @@
     </w:p>
     <w:p>
       <w:pPr>
-        <w:pStyle w:val="berschrift1"/>
+        <w:pStyle w:val="Heading1"/>
       </w:pPr>
       <w:r>
         <w:t>Cooperation</w:t>
@@ -3738,18 +3991,7 @@
           <w:szCs w:val="20"/>
           <w:lang w:eastAsia="en-GB"/>
         </w:rPr>
-        <w:t xml:space="preserve"> in this Agreement, </w:t>
-      </w:r>
-      <w:r>
-        <w:rPr>
-          <w:rFonts w:eastAsia="Arial" w:cstheme="minorHAnsi"/>
-          <w:bCs/>
-          <w:sz w:val="20"/>
-          <w:szCs w:val="20"/>
-          <w:lang w:eastAsia="en-GB"/>
-        </w:rPr>
-        <w:lastRenderedPageBreak/>
-        <w:t xml:space="preserve">the </w:t>
+        <w:t xml:space="preserve"> in this Agreement, the </w:t>
       </w:r>
       <w:sdt>
         <w:sdtPr>
@@ -3758,6 +4000,7 @@
           <w:id w:val="1268794791"/>
         </w:sdtPr>
         <w:sdtContent>
+          <w:proofErr w:type="spellStart"/>
           <w:r>
             <w:rPr>
               <w:rFonts w:eastAsia="Arial" w:cstheme="minorHAnsi"/>
@@ -3768,6 +4011,7 @@
             </w:rPr>
             <w:t>Author</w:t>
           </w:r>
+          <w:proofErr w:type="spellEnd"/>
         </w:sdtContent>
       </w:sdt>
       <w:r>
@@ -3787,6 +4031,7 @@
           <w:id w:val="1824529826"/>
         </w:sdtPr>
         <w:sdtContent>
+          <w:proofErr w:type="spellStart"/>
           <w:r>
             <w:rPr>
               <w:rFonts w:eastAsia="Arial" w:cstheme="minorHAnsi"/>
@@ -3797,6 +4042,7 @@
             </w:rPr>
             <w:t>Author</w:t>
           </w:r>
+          <w:proofErr w:type="spellEnd"/>
         </w:sdtContent>
       </w:sdt>
       <w:r>
@@ -3816,6 +4062,7 @@
           <w:id w:val="1482542211"/>
         </w:sdtPr>
         <w:sdtContent>
+          <w:proofErr w:type="spellStart"/>
           <w:r>
             <w:rPr>
               <w:rFonts w:eastAsia="Arial" w:cstheme="minorHAnsi"/>
@@ -3826,6 +4073,7 @@
             </w:rPr>
             <w:t>Author</w:t>
           </w:r>
+          <w:proofErr w:type="spellEnd"/>
         </w:sdtContent>
       </w:sdt>
       <w:r>
@@ -3898,7 +4146,7 @@
     </w:p>
     <w:p>
       <w:pPr>
-        <w:pStyle w:val="berschrift1"/>
+        <w:pStyle w:val="Heading1"/>
       </w:pPr>
       <w:r>
         <w:t>Author List</w:t>
@@ -3931,7 +4179,7 @@
     </w:p>
     <w:p>
       <w:pPr>
-        <w:pStyle w:val="berschrift1"/>
+        <w:pStyle w:val="Heading1"/>
       </w:pPr>
       <w:r>
         <w:t>Post Publication Actions</w:t>
@@ -3993,7 +4241,7 @@
     </w:p>
     <w:p>
       <w:pPr>
-        <w:pStyle w:val="berschrift1"/>
+        <w:pStyle w:val="Heading1"/>
       </w:pPr>
       <w:r>
         <w:t>Controlling Terms</w:t>
@@ -4065,7 +4313,7 @@
     </w:p>
     <w:p>
       <w:pPr>
-        <w:pStyle w:val="berschrift1"/>
+        <w:pStyle w:val="Heading1"/>
       </w:pPr>
       <w:r>
         <w:t>Governing Law</w:t>
@@ -4239,7 +4487,7 @@
     </w:p>
     <w:tbl>
       <w:tblPr>
-        <w:tblStyle w:val="Tabellenraster"/>
+        <w:tblStyle w:val="TableGrid"/>
         <w:tblW w:w="11169" w:type="dxa"/>
         <w:tblInd w:w="-993" w:type="dxa"/>
         <w:tblBorders>
@@ -4729,7 +4977,7 @@
     </w:p>
     <w:tbl>
       <w:tblPr>
-        <w:tblStyle w:val="Tabellenraster"/>
+        <w:tblStyle w:val="TableGrid"/>
         <w:tblW w:w="11169" w:type="dxa"/>
         <w:tblInd w:w="-993" w:type="dxa"/>
         <w:tblBorders>
@@ -5146,7 +5394,27 @@
               <w:szCs w:val="15"/>
               <w:lang w:val="de-DE" w:eastAsia="en-GB"/>
             </w:rPr>
-            <w:t>Springer Nature Switzerland AG</w:t>
+            <w:t xml:space="preserve">Springer Nature </w:t>
+          </w:r>
+          <w:proofErr w:type="spellStart"/>
+          <w:r>
+            <w:rPr>
+              <w:rFonts w:eastAsia="Arial" w:cstheme="minorHAnsi"/>
+              <w:sz w:val="15"/>
+              <w:szCs w:val="15"/>
+              <w:lang w:val="de-DE" w:eastAsia="en-GB"/>
+            </w:rPr>
+            <w:t>Switzerland</w:t>
+          </w:r>
+          <w:proofErr w:type="spellEnd"/>
+          <w:r>
+            <w:rPr>
+              <w:rFonts w:eastAsia="Arial" w:cstheme="minorHAnsi"/>
+              <w:sz w:val="15"/>
+              <w:szCs w:val="15"/>
+              <w:lang w:val="de-DE" w:eastAsia="en-GB"/>
+            </w:rPr>
+            <w:t xml:space="preserve"> AG</w:t>
           </w:r>
         </w:sdtContent>
       </w:sdt>
@@ -5166,6 +5434,7 @@
           <w:id w:val="1720135088"/>
         </w:sdtPr>
         <w:sdtContent>
+          <w:proofErr w:type="spellStart"/>
           <w:r>
             <w:rPr>
               <w:rFonts w:eastAsia="Arial" w:cstheme="minorHAnsi"/>
@@ -5173,8 +5442,29 @@
               <w:szCs w:val="15"/>
               <w:lang w:val="de-DE" w:eastAsia="en-GB"/>
             </w:rPr>
-            <w:t>Gewerbestrasse 11, 6330 Cham, Switzerland</w:t>
+            <w:t>Gewerbestrasse</w:t>
           </w:r>
+          <w:proofErr w:type="spellEnd"/>
+          <w:r>
+            <w:rPr>
+              <w:rFonts w:eastAsia="Arial" w:cstheme="minorHAnsi"/>
+              <w:sz w:val="15"/>
+              <w:szCs w:val="15"/>
+              <w:lang w:val="de-DE" w:eastAsia="en-GB"/>
+            </w:rPr>
+            <w:t xml:space="preserve"> 11, 6330 Cham, </w:t>
+          </w:r>
+          <w:proofErr w:type="spellStart"/>
+          <w:r>
+            <w:rPr>
+              <w:rFonts w:eastAsia="Arial" w:cstheme="minorHAnsi"/>
+              <w:sz w:val="15"/>
+              <w:szCs w:val="15"/>
+              <w:lang w:val="de-DE" w:eastAsia="en-GB"/>
+            </w:rPr>
+            <w:t>Switzerland</w:t>
+          </w:r>
+          <w:proofErr w:type="spellEnd"/>
         </w:sdtContent>
       </w:sdt>
       <w:sdt>
@@ -5253,7 +5543,7 @@
     </w:p>
     <w:p>
       <w:pPr>
-        <w:pStyle w:val="StandardWeb"/>
+        <w:pStyle w:val="NormalWeb"/>
         <w:spacing w:before="0" w:beforeAutospacing="0" w:after="0" w:afterAutospacing="0"/>
         <w:rPr>
           <w:rFonts w:asciiTheme="minorHAnsi" w:hAnsiTheme="minorHAnsi" w:cstheme="minorHAnsi"/>
@@ -5371,7 +5661,7 @@
     </w:p>
     <w:p>
       <w:pPr>
-        <w:pStyle w:val="StandardWeb"/>
+        <w:pStyle w:val="NormalWeb"/>
         <w:spacing w:before="0" w:beforeAutospacing="0" w:after="0" w:afterAutospacing="0"/>
         <w:rPr>
           <w:rFonts w:asciiTheme="minorHAnsi" w:hAnsiTheme="minorHAnsi" w:cstheme="minorHAnsi"/>
@@ -5385,6 +5675,7 @@
           <w:sz w:val="16"/>
           <w:szCs w:val="16"/>
         </w:rPr>
+        <w:lastRenderedPageBreak/>
         <w:t xml:space="preserve">PS: </w:t>
       </w:r>
       <w:r>
@@ -5497,7 +5788,7 @@
 </file>
 
 <file path=word/endnotes.xml><?xml version="1.0" encoding="utf-8"?>
-<w:endnotes xmlns:wpc="http://schemas.microsoft.com/office/word/2010/wordprocessingCanvas" xmlns:cx="http://schemas.microsoft.com/office/drawing/2014/chartex" xmlns:cx1="http://schemas.microsoft.com/office/drawing/2015/9/8/chartex" xmlns:cx2="http://schemas.microsoft.com/office/drawing/2015/10/21/chartex" xmlns:cx3="http://schemas.microsoft.com/office/drawing/2016/5/9/chartex" xmlns:cx4="http://schemas.microsoft.com/office/drawing/2016/5/10/chartex" xmlns:cx5="http://schemas.microsoft.com/office/drawing/2016/5/11/chartex" xmlns:cx6="http://schemas.microsoft.com/office/drawing/2016/5/12/chartex" xmlns:cx7="http://schemas.microsoft.com/office/drawing/2016/5/13/chartex" xmlns:cx8="http://schemas.microsoft.com/office/drawing/2016/5/14/chartex" xmlns:mc="http://schemas.openxmlformats.org/markup-compatibility/2006" xmlns:aink="http://schemas.microsoft.com/office/drawing/2016/ink" xmlns:am3d="http://schemas.microsoft.com/office/drawing/2017/model3d" xmlns:o="urn:schemas-microsoft-com:office:office" xmlns:oel="http://schemas.microsoft.com/office/2019/extlst" xmlns:r="http://schemas.openxmlformats.org/officeDocument/2006/relationships" xmlns:m="http://schemas.openxmlformats.org/officeDocument/2006/math" xmlns:v="urn:schemas-microsoft-com:vml" xmlns:wp14="http://schemas.microsoft.com/office/word/2010/wordprocessingDrawing" xmlns:wp="http://schemas.openxmlformats.org/drawingml/2006/wordprocessingDrawing" xmlns:w10="urn:schemas-microsoft-com:office:word" xmlns:w="http://schemas.openxmlformats.org/wordprocessingml/2006/main" xmlns:w14="http://schemas.microsoft.com/office/word/2010/wordml" xmlns:w15="http://schemas.microsoft.com/office/word/2012/wordml" xmlns:w16cex="http://schemas.microsoft.com/office/word/2018/wordml/cex" xmlns:w16cid="http://schemas.microsoft.com/office/word/2016/wordml/cid" xmlns:w16="http://schemas.microsoft.com/office/word/2018/wordml" xmlns:w16du="http://schemas.microsoft.com/office/word/2023/wordml/word16du" xmlns:w16sdtdh="http://schemas.microsoft.com/office/word/2020/wordml/sdtdatahash" xmlns:w16sdtfl="http://schemas.microsoft.com/office/word/2024/wordml/sdtformatlock" xmlns:w16se="http://schemas.microsoft.com/office/word/2015/wordml/symex" xmlns:wpg="http://schemas.microsoft.com/office/word/2010/wordprocessingGroup" xmlns:wpi="http://schemas.microsoft.com/office/word/2010/wordprocessingInk" xmlns:wne="http://schemas.microsoft.com/office/word/2006/wordml" xmlns:wps="http://schemas.microsoft.com/office/word/2010/wordprocessingShape" mc:Ignorable="w14 w15 w16se w16cid w16 w16cex w16sdtdh w16sdtfl w16du wp14">
+<w:endnotes xmlns:wpc="http://schemas.microsoft.com/office/word/2010/wordprocessingCanvas" xmlns:cx="http://schemas.microsoft.com/office/drawing/2014/chartex" xmlns:cx1="http://schemas.microsoft.com/office/drawing/2015/9/8/chartex" xmlns:cx2="http://schemas.microsoft.com/office/drawing/2015/10/21/chartex" xmlns:cx3="http://schemas.microsoft.com/office/drawing/2016/5/9/chartex" xmlns:cx4="http://schemas.microsoft.com/office/drawing/2016/5/10/chartex" xmlns:cx5="http://schemas.microsoft.com/office/drawing/2016/5/11/chartex" xmlns:cx6="http://schemas.microsoft.com/office/drawing/2016/5/12/chartex" xmlns:cx7="http://schemas.microsoft.com/office/drawing/2016/5/13/chartex" xmlns:cx8="http://schemas.microsoft.com/office/drawing/2016/5/14/chartex" xmlns:mc="http://schemas.openxmlformats.org/markup-compatibility/2006" xmlns:m="http://schemas.openxmlformats.org/officeDocument/2006/math" xmlns:aink="http://schemas.microsoft.com/office/drawing/2016/ink" xmlns:am3d="http://schemas.microsoft.com/office/drawing/2017/model3d" xmlns:oel="http://schemas.microsoft.com/office/2019/extlst" xmlns:r="http://schemas.openxmlformats.org/officeDocument/2006/relationships" xmlns:wp14="http://schemas.microsoft.com/office/word/2010/wordprocessingDrawing" xmlns:wp="http://schemas.openxmlformats.org/drawingml/2006/wordprocessingDrawing" xmlns:wpg="http://schemas.microsoft.com/office/word/2010/wordprocessingGroup" xmlns:wpi="http://schemas.microsoft.com/office/word/2010/wordprocessingInk" xmlns:wps="http://schemas.microsoft.com/office/word/2010/wordprocessingShape" xmlns:o="urn:schemas-microsoft-com:office:office" xmlns:v="urn:schemas-microsoft-com:vml" xmlns:w10="urn:schemas-microsoft-com:office:word" xmlns:w="http://schemas.openxmlformats.org/wordprocessingml/2006/main" xmlns:w14="http://schemas.microsoft.com/office/word/2010/wordml" xmlns:w15="http://schemas.microsoft.com/office/word/2012/wordml" xmlns:w16cex="http://schemas.microsoft.com/office/word/2018/wordml/cex" xmlns:w16cid="http://schemas.microsoft.com/office/word/2016/wordml/cid" xmlns:w16="http://schemas.microsoft.com/office/word/2018/wordml" xmlns:w16sdtdh="http://schemas.microsoft.com/office/word/2020/wordml/sdtdatahash" xmlns:w16sdtfl="http://schemas.microsoft.com/office/word/2024/wordml/sdtformatlock" xmlns:w16se="http://schemas.microsoft.com/office/word/2015/wordml/symex" xmlns:w16du="http://schemas.microsoft.com/office/word/2023/wordml/word16du" xmlns:wne="http://schemas.microsoft.com/office/word/2006/wordml" mc:Ignorable="w14 w15 w16se w16cid w16 w16cex w16sdtdh w16sdtfl w16du wp14">
   <w:endnote w:type="separator" w:id="-1">
     <w:p>
       <w:pPr>
@@ -5522,17 +5813,17 @@
 </file>
 
 <file path=word/footer1.xml><?xml version="1.0" encoding="utf-8"?>
-<w:ftr xmlns:wpc="http://schemas.microsoft.com/office/word/2010/wordprocessingCanvas" xmlns:cx="http://schemas.microsoft.com/office/drawing/2014/chartex" xmlns:cx1="http://schemas.microsoft.com/office/drawing/2015/9/8/chartex" xmlns:cx2="http://schemas.microsoft.com/office/drawing/2015/10/21/chartex" xmlns:cx3="http://schemas.microsoft.com/office/drawing/2016/5/9/chartex" xmlns:cx4="http://schemas.microsoft.com/office/drawing/2016/5/10/chartex" xmlns:cx5="http://schemas.microsoft.com/office/drawing/2016/5/11/chartex" xmlns:cx6="http://schemas.microsoft.com/office/drawing/2016/5/12/chartex" xmlns:cx7="http://schemas.microsoft.com/office/drawing/2016/5/13/chartex" xmlns:cx8="http://schemas.microsoft.com/office/drawing/2016/5/14/chartex" xmlns:mc="http://schemas.openxmlformats.org/markup-compatibility/2006" xmlns:aink="http://schemas.microsoft.com/office/drawing/2016/ink" xmlns:am3d="http://schemas.microsoft.com/office/drawing/2017/model3d" xmlns:o="urn:schemas-microsoft-com:office:office" xmlns:oel="http://schemas.microsoft.com/office/2019/extlst" xmlns:r="http://schemas.openxmlformats.org/officeDocument/2006/relationships" xmlns:m="http://schemas.openxmlformats.org/officeDocument/2006/math" xmlns:v="urn:schemas-microsoft-com:vml" xmlns:wp14="http://schemas.microsoft.com/office/word/2010/wordprocessingDrawing" xmlns:wp="http://schemas.openxmlformats.org/drawingml/2006/wordprocessingDrawing" xmlns:w10="urn:schemas-microsoft-com:office:word" xmlns:w="http://schemas.openxmlformats.org/wordprocessingml/2006/main" xmlns:w14="http://schemas.microsoft.com/office/word/2010/wordml" xmlns:w15="http://schemas.microsoft.com/office/word/2012/wordml" xmlns:w16cex="http://schemas.microsoft.com/office/word/2018/wordml/cex" xmlns:w16cid="http://schemas.microsoft.com/office/word/2016/wordml/cid" xmlns:w16="http://schemas.microsoft.com/office/word/2018/wordml" xmlns:w16du="http://schemas.microsoft.com/office/word/2023/wordml/word16du" xmlns:w16sdtdh="http://schemas.microsoft.com/office/word/2020/wordml/sdtdatahash" xmlns:w16sdtfl="http://schemas.microsoft.com/office/word/2024/wordml/sdtformatlock" xmlns:w16se="http://schemas.microsoft.com/office/word/2015/wordml/symex" xmlns:wpg="http://schemas.microsoft.com/office/word/2010/wordprocessingGroup" xmlns:wpi="http://schemas.microsoft.com/office/word/2010/wordprocessingInk" xmlns:wne="http://schemas.microsoft.com/office/word/2006/wordml" xmlns:wps="http://schemas.microsoft.com/office/word/2010/wordprocessingShape" mc:Ignorable="w14 w15 w16se w16cid w16 w16cex w16sdtdh w16sdtfl w16du wp14">
+<w:ftr xmlns:wpc="http://schemas.microsoft.com/office/word/2010/wordprocessingCanvas" xmlns:cx="http://schemas.microsoft.com/office/drawing/2014/chartex" xmlns:cx1="http://schemas.microsoft.com/office/drawing/2015/9/8/chartex" xmlns:cx2="http://schemas.microsoft.com/office/drawing/2015/10/21/chartex" xmlns:cx3="http://schemas.microsoft.com/office/drawing/2016/5/9/chartex" xmlns:cx4="http://schemas.microsoft.com/office/drawing/2016/5/10/chartex" xmlns:cx5="http://schemas.microsoft.com/office/drawing/2016/5/11/chartex" xmlns:cx6="http://schemas.microsoft.com/office/drawing/2016/5/12/chartex" xmlns:cx7="http://schemas.microsoft.com/office/drawing/2016/5/13/chartex" xmlns:cx8="http://schemas.microsoft.com/office/drawing/2016/5/14/chartex" xmlns:mc="http://schemas.openxmlformats.org/markup-compatibility/2006" xmlns:m="http://schemas.openxmlformats.org/officeDocument/2006/math" xmlns:aink="http://schemas.microsoft.com/office/drawing/2016/ink" xmlns:am3d="http://schemas.microsoft.com/office/drawing/2017/model3d" xmlns:oel="http://schemas.microsoft.com/office/2019/extlst" xmlns:r="http://schemas.openxmlformats.org/officeDocument/2006/relationships" xmlns:wp14="http://schemas.microsoft.com/office/word/2010/wordprocessingDrawing" xmlns:wp="http://schemas.openxmlformats.org/drawingml/2006/wordprocessingDrawing" xmlns:wpg="http://schemas.microsoft.com/office/word/2010/wordprocessingGroup" xmlns:wpi="http://schemas.microsoft.com/office/word/2010/wordprocessingInk" xmlns:wps="http://schemas.microsoft.com/office/word/2010/wordprocessingShape" xmlns:o="urn:schemas-microsoft-com:office:office" xmlns:v="urn:schemas-microsoft-com:vml" xmlns:w10="urn:schemas-microsoft-com:office:word" xmlns:w="http://schemas.openxmlformats.org/wordprocessingml/2006/main" xmlns:w14="http://schemas.microsoft.com/office/word/2010/wordml" xmlns:w15="http://schemas.microsoft.com/office/word/2012/wordml" xmlns:w16cex="http://schemas.microsoft.com/office/word/2018/wordml/cex" xmlns:w16cid="http://schemas.microsoft.com/office/word/2016/wordml/cid" xmlns:w16="http://schemas.microsoft.com/office/word/2018/wordml" xmlns:w16sdtdh="http://schemas.microsoft.com/office/word/2020/wordml/sdtdatahash" xmlns:w16sdtfl="http://schemas.microsoft.com/office/word/2024/wordml/sdtformatlock" xmlns:w16se="http://schemas.microsoft.com/office/word/2015/wordml/symex" xmlns:w16du="http://schemas.microsoft.com/office/word/2023/wordml/word16du" xmlns:wne="http://schemas.microsoft.com/office/word/2006/wordml" mc:Ignorable="w14 w15 w16se w16cid w16 w16cex w16sdtdh w16sdtfl w16du wp14">
   <w:p>
     <w:pPr>
-      <w:pStyle w:val="Fuzeile"/>
+      <w:pStyle w:val="Footer"/>
     </w:pPr>
   </w:p>
 </w:ftr>
 </file>
 
 <file path=word/footer2.xml><?xml version="1.0" encoding="utf-8"?>
-<w:ftr xmlns:wpc="http://schemas.microsoft.com/office/word/2010/wordprocessingCanvas" xmlns:cx="http://schemas.microsoft.com/office/drawing/2014/chartex" xmlns:cx1="http://schemas.microsoft.com/office/drawing/2015/9/8/chartex" xmlns:cx2="http://schemas.microsoft.com/office/drawing/2015/10/21/chartex" xmlns:cx3="http://schemas.microsoft.com/office/drawing/2016/5/9/chartex" xmlns:cx4="http://schemas.microsoft.com/office/drawing/2016/5/10/chartex" xmlns:cx5="http://schemas.microsoft.com/office/drawing/2016/5/11/chartex" xmlns:cx6="http://schemas.microsoft.com/office/drawing/2016/5/12/chartex" xmlns:cx7="http://schemas.microsoft.com/office/drawing/2016/5/13/chartex" xmlns:cx8="http://schemas.microsoft.com/office/drawing/2016/5/14/chartex" xmlns:mc="http://schemas.openxmlformats.org/markup-compatibility/2006" xmlns:aink="http://schemas.microsoft.com/office/drawing/2016/ink" xmlns:am3d="http://schemas.microsoft.com/office/drawing/2017/model3d" xmlns:o="urn:schemas-microsoft-com:office:office" xmlns:oel="http://schemas.microsoft.com/office/2019/extlst" xmlns:r="http://schemas.openxmlformats.org/officeDocument/2006/relationships" xmlns:m="http://schemas.openxmlformats.org/officeDocument/2006/math" xmlns:v="urn:schemas-microsoft-com:vml" xmlns:wp14="http://schemas.microsoft.com/office/word/2010/wordprocessingDrawing" xmlns:wp="http://schemas.openxmlformats.org/drawingml/2006/wordprocessingDrawing" xmlns:w10="urn:schemas-microsoft-com:office:word" xmlns:w="http://schemas.openxmlformats.org/wordprocessingml/2006/main" xmlns:w14="http://schemas.microsoft.com/office/word/2010/wordml" xmlns:w15="http://schemas.microsoft.com/office/word/2012/wordml" xmlns:w16cex="http://schemas.microsoft.com/office/word/2018/wordml/cex" xmlns:w16cid="http://schemas.microsoft.com/office/word/2016/wordml/cid" xmlns:w16="http://schemas.microsoft.com/office/word/2018/wordml" xmlns:w16du="http://schemas.microsoft.com/office/word/2023/wordml/word16du" xmlns:w16sdtdh="http://schemas.microsoft.com/office/word/2020/wordml/sdtdatahash" xmlns:w16sdtfl="http://schemas.microsoft.com/office/word/2024/wordml/sdtformatlock" xmlns:w16se="http://schemas.microsoft.com/office/word/2015/wordml/symex" xmlns:wpg="http://schemas.microsoft.com/office/word/2010/wordprocessingGroup" xmlns:wpi="http://schemas.microsoft.com/office/word/2010/wordprocessingInk" xmlns:wne="http://schemas.microsoft.com/office/word/2006/wordml" xmlns:wps="http://schemas.microsoft.com/office/word/2010/wordprocessingShape" mc:Ignorable="w14 w15 w16se w16cid w16 w16cex w16sdtdh w16sdtfl w16du wp14">
+<w:ftr xmlns:wpc="http://schemas.microsoft.com/office/word/2010/wordprocessingCanvas" xmlns:cx="http://schemas.microsoft.com/office/drawing/2014/chartex" xmlns:cx1="http://schemas.microsoft.com/office/drawing/2015/9/8/chartex" xmlns:cx2="http://schemas.microsoft.com/office/drawing/2015/10/21/chartex" xmlns:cx3="http://schemas.microsoft.com/office/drawing/2016/5/9/chartex" xmlns:cx4="http://schemas.microsoft.com/office/drawing/2016/5/10/chartex" xmlns:cx5="http://schemas.microsoft.com/office/drawing/2016/5/11/chartex" xmlns:cx6="http://schemas.microsoft.com/office/drawing/2016/5/12/chartex" xmlns:cx7="http://schemas.microsoft.com/office/drawing/2016/5/13/chartex" xmlns:cx8="http://schemas.microsoft.com/office/drawing/2016/5/14/chartex" xmlns:mc="http://schemas.openxmlformats.org/markup-compatibility/2006" xmlns:m="http://schemas.openxmlformats.org/officeDocument/2006/math" xmlns:aink="http://schemas.microsoft.com/office/drawing/2016/ink" xmlns:am3d="http://schemas.microsoft.com/office/drawing/2017/model3d" xmlns:oel="http://schemas.microsoft.com/office/2019/extlst" xmlns:r="http://schemas.openxmlformats.org/officeDocument/2006/relationships" xmlns:wp14="http://schemas.microsoft.com/office/word/2010/wordprocessingDrawing" xmlns:wp="http://schemas.openxmlformats.org/drawingml/2006/wordprocessingDrawing" xmlns:wpg="http://schemas.microsoft.com/office/word/2010/wordprocessingGroup" xmlns:wpi="http://schemas.microsoft.com/office/word/2010/wordprocessingInk" xmlns:wps="http://schemas.microsoft.com/office/word/2010/wordprocessingShape" xmlns:o="urn:schemas-microsoft-com:office:office" xmlns:v="urn:schemas-microsoft-com:vml" xmlns:w10="urn:schemas-microsoft-com:office:word" xmlns:w="http://schemas.openxmlformats.org/wordprocessingml/2006/main" xmlns:w14="http://schemas.microsoft.com/office/word/2010/wordml" xmlns:w15="http://schemas.microsoft.com/office/word/2012/wordml" xmlns:w16cex="http://schemas.microsoft.com/office/word/2018/wordml/cex" xmlns:w16cid="http://schemas.microsoft.com/office/word/2016/wordml/cid" xmlns:w16="http://schemas.microsoft.com/office/word/2018/wordml" xmlns:w16sdtdh="http://schemas.microsoft.com/office/word/2020/wordml/sdtdatahash" xmlns:w16sdtfl="http://schemas.microsoft.com/office/word/2024/wordml/sdtformatlock" xmlns:w16se="http://schemas.microsoft.com/office/word/2015/wordml/symex" xmlns:w16du="http://schemas.microsoft.com/office/word/2023/wordml/word16du" xmlns:wne="http://schemas.microsoft.com/office/word/2006/wordml" mc:Ignorable="w14 w15 w16se w16cid w16 w16cex w16sdtdh w16sdtfl w16du wp14">
   <w:sdt>
     <w:sdtPr>
       <w:rPr>
@@ -5561,7 +5852,7 @@
         <w:sdtContent>
           <w:p>
             <w:pPr>
-              <w:pStyle w:val="Fuzeile"/>
+              <w:pStyle w:val="Footer"/>
               <w:jc w:val="right"/>
               <w:rPr>
                 <w:sz w:val="16"/>
@@ -5681,24 +5972,24 @@
   </w:sdt>
   <w:p>
     <w:pPr>
-      <w:pStyle w:val="Fuzeile"/>
+      <w:pStyle w:val="Footer"/>
     </w:pPr>
   </w:p>
 </w:ftr>
 </file>
 
 <file path=word/footer3.xml><?xml version="1.0" encoding="utf-8"?>
-<w:ftr xmlns:wpc="http://schemas.microsoft.com/office/word/2010/wordprocessingCanvas" xmlns:cx="http://schemas.microsoft.com/office/drawing/2014/chartex" xmlns:cx1="http://schemas.microsoft.com/office/drawing/2015/9/8/chartex" xmlns:cx2="http://schemas.microsoft.com/office/drawing/2015/10/21/chartex" xmlns:cx3="http://schemas.microsoft.com/office/drawing/2016/5/9/chartex" xmlns:cx4="http://schemas.microsoft.com/office/drawing/2016/5/10/chartex" xmlns:cx5="http://schemas.microsoft.com/office/drawing/2016/5/11/chartex" xmlns:cx6="http://schemas.microsoft.com/office/drawing/2016/5/12/chartex" xmlns:cx7="http://schemas.microsoft.com/office/drawing/2016/5/13/chartex" xmlns:cx8="http://schemas.microsoft.com/office/drawing/2016/5/14/chartex" xmlns:mc="http://schemas.openxmlformats.org/markup-compatibility/2006" xmlns:aink="http://schemas.microsoft.com/office/drawing/2016/ink" xmlns:am3d="http://schemas.microsoft.com/office/drawing/2017/model3d" xmlns:o="urn:schemas-microsoft-com:office:office" xmlns:oel="http://schemas.microsoft.com/office/2019/extlst" xmlns:r="http://schemas.openxmlformats.org/officeDocument/2006/relationships" xmlns:m="http://schemas.openxmlformats.org/officeDocument/2006/math" xmlns:v="urn:schemas-microsoft-com:vml" xmlns:wp14="http://schemas.microsoft.com/office/word/2010/wordprocessingDrawing" xmlns:wp="http://schemas.openxmlformats.org/drawingml/2006/wordprocessingDrawing" xmlns:w10="urn:schemas-microsoft-com:office:word" xmlns:w="http://schemas.openxmlformats.org/wordprocessingml/2006/main" xmlns:w14="http://schemas.microsoft.com/office/word/2010/wordml" xmlns:w15="http://schemas.microsoft.com/office/word/2012/wordml" xmlns:w16cex="http://schemas.microsoft.com/office/word/2018/wordml/cex" xmlns:w16cid="http://schemas.microsoft.com/office/word/2016/wordml/cid" xmlns:w16="http://schemas.microsoft.com/office/word/2018/wordml" xmlns:w16du="http://schemas.microsoft.com/office/word/2023/wordml/word16du" xmlns:w16sdtdh="http://schemas.microsoft.com/office/word/2020/wordml/sdtdatahash" xmlns:w16sdtfl="http://schemas.microsoft.com/office/word/2024/wordml/sdtformatlock" xmlns:w16se="http://schemas.microsoft.com/office/word/2015/wordml/symex" xmlns:wpg="http://schemas.microsoft.com/office/word/2010/wordprocessingGroup" xmlns:wpi="http://schemas.microsoft.com/office/word/2010/wordprocessingInk" xmlns:wne="http://schemas.microsoft.com/office/word/2006/wordml" xmlns:wps="http://schemas.microsoft.com/office/word/2010/wordprocessingShape" mc:Ignorable="w14 w15 w16se w16cid w16 w16cex w16sdtdh w16sdtfl w16du wp14">
+<w:ftr xmlns:wpc="http://schemas.microsoft.com/office/word/2010/wordprocessingCanvas" xmlns:cx="http://schemas.microsoft.com/office/drawing/2014/chartex" xmlns:cx1="http://schemas.microsoft.com/office/drawing/2015/9/8/chartex" xmlns:cx2="http://schemas.microsoft.com/office/drawing/2015/10/21/chartex" xmlns:cx3="http://schemas.microsoft.com/office/drawing/2016/5/9/chartex" xmlns:cx4="http://schemas.microsoft.com/office/drawing/2016/5/10/chartex" xmlns:cx5="http://schemas.microsoft.com/office/drawing/2016/5/11/chartex" xmlns:cx6="http://schemas.microsoft.com/office/drawing/2016/5/12/chartex" xmlns:cx7="http://schemas.microsoft.com/office/drawing/2016/5/13/chartex" xmlns:cx8="http://schemas.microsoft.com/office/drawing/2016/5/14/chartex" xmlns:mc="http://schemas.openxmlformats.org/markup-compatibility/2006" xmlns:m="http://schemas.openxmlformats.org/officeDocument/2006/math" xmlns:aink="http://schemas.microsoft.com/office/drawing/2016/ink" xmlns:am3d="http://schemas.microsoft.com/office/drawing/2017/model3d" xmlns:oel="http://schemas.microsoft.com/office/2019/extlst" xmlns:r="http://schemas.openxmlformats.org/officeDocument/2006/relationships" xmlns:wp14="http://schemas.microsoft.com/office/word/2010/wordprocessingDrawing" xmlns:wp="http://schemas.openxmlformats.org/drawingml/2006/wordprocessingDrawing" xmlns:wpg="http://schemas.microsoft.com/office/word/2010/wordprocessingGroup" xmlns:wpi="http://schemas.microsoft.com/office/word/2010/wordprocessingInk" xmlns:wps="http://schemas.microsoft.com/office/word/2010/wordprocessingShape" xmlns:o="urn:schemas-microsoft-com:office:office" xmlns:v="urn:schemas-microsoft-com:vml" xmlns:w10="urn:schemas-microsoft-com:office:word" xmlns:w="http://schemas.openxmlformats.org/wordprocessingml/2006/main" xmlns:w14="http://schemas.microsoft.com/office/word/2010/wordml" xmlns:w15="http://schemas.microsoft.com/office/word/2012/wordml" xmlns:w16cex="http://schemas.microsoft.com/office/word/2018/wordml/cex" xmlns:w16cid="http://schemas.microsoft.com/office/word/2016/wordml/cid" xmlns:w16="http://schemas.microsoft.com/office/word/2018/wordml" xmlns:w16sdtdh="http://schemas.microsoft.com/office/word/2020/wordml/sdtdatahash" xmlns:w16sdtfl="http://schemas.microsoft.com/office/word/2024/wordml/sdtformatlock" xmlns:w16se="http://schemas.microsoft.com/office/word/2015/wordml/symex" xmlns:w16du="http://schemas.microsoft.com/office/word/2023/wordml/word16du" xmlns:wne="http://schemas.microsoft.com/office/word/2006/wordml" mc:Ignorable="w14 w15 w16se w16cid w16 w16cex w16sdtdh w16sdtfl w16du wp14">
   <w:p>
     <w:pPr>
-      <w:pStyle w:val="Fuzeile"/>
+      <w:pStyle w:val="Footer"/>
     </w:pPr>
   </w:p>
 </w:ftr>
 </file>
 
 <file path=word/footnotes.xml><?xml version="1.0" encoding="utf-8"?>
-<w:footnotes xmlns:wpc="http://schemas.microsoft.com/office/word/2010/wordprocessingCanvas" xmlns:cx="http://schemas.microsoft.com/office/drawing/2014/chartex" xmlns:cx1="http://schemas.microsoft.com/office/drawing/2015/9/8/chartex" xmlns:cx2="http://schemas.microsoft.com/office/drawing/2015/10/21/chartex" xmlns:cx3="http://schemas.microsoft.com/office/drawing/2016/5/9/chartex" xmlns:cx4="http://schemas.microsoft.com/office/drawing/2016/5/10/chartex" xmlns:cx5="http://schemas.microsoft.com/office/drawing/2016/5/11/chartex" xmlns:cx6="http://schemas.microsoft.com/office/drawing/2016/5/12/chartex" xmlns:cx7="http://schemas.microsoft.com/office/drawing/2016/5/13/chartex" xmlns:cx8="http://schemas.microsoft.com/office/drawing/2016/5/14/chartex" xmlns:mc="http://schemas.openxmlformats.org/markup-compatibility/2006" xmlns:aink="http://schemas.microsoft.com/office/drawing/2016/ink" xmlns:am3d="http://schemas.microsoft.com/office/drawing/2017/model3d" xmlns:o="urn:schemas-microsoft-com:office:office" xmlns:oel="http://schemas.microsoft.com/office/2019/extlst" xmlns:r="http://schemas.openxmlformats.org/officeDocument/2006/relationships" xmlns:m="http://schemas.openxmlformats.org/officeDocument/2006/math" xmlns:v="urn:schemas-microsoft-com:vml" xmlns:wp14="http://schemas.microsoft.com/office/word/2010/wordprocessingDrawing" xmlns:wp="http://schemas.openxmlformats.org/drawingml/2006/wordprocessingDrawing" xmlns:w10="urn:schemas-microsoft-com:office:word" xmlns:w="http://schemas.openxmlformats.org/wordprocessingml/2006/main" xmlns:w14="http://schemas.microsoft.com/office/word/2010/wordml" xmlns:w15="http://schemas.microsoft.com/office/word/2012/wordml" xmlns:w16cex="http://schemas.microsoft.com/office/word/2018/wordml/cex" xmlns:w16cid="http://schemas.microsoft.com/office/word/2016/wordml/cid" xmlns:w16="http://schemas.microsoft.com/office/word/2018/wordml" xmlns:w16du="http://schemas.microsoft.com/office/word/2023/wordml/word16du" xmlns:w16sdtdh="http://schemas.microsoft.com/office/word/2020/wordml/sdtdatahash" xmlns:w16sdtfl="http://schemas.microsoft.com/office/word/2024/wordml/sdtformatlock" xmlns:w16se="http://schemas.microsoft.com/office/word/2015/wordml/symex" xmlns:wpg="http://schemas.microsoft.com/office/word/2010/wordprocessingGroup" xmlns:wpi="http://schemas.microsoft.com/office/word/2010/wordprocessingInk" xmlns:wne="http://schemas.microsoft.com/office/word/2006/wordml" xmlns:wps="http://schemas.microsoft.com/office/word/2010/wordprocessingShape" mc:Ignorable="w14 w15 w16se w16cid w16 w16cex w16sdtdh w16sdtfl w16du wp14">
+<w:footnotes xmlns:wpc="http://schemas.microsoft.com/office/word/2010/wordprocessingCanvas" xmlns:cx="http://schemas.microsoft.com/office/drawing/2014/chartex" xmlns:cx1="http://schemas.microsoft.com/office/drawing/2015/9/8/chartex" xmlns:cx2="http://schemas.microsoft.com/office/drawing/2015/10/21/chartex" xmlns:cx3="http://schemas.microsoft.com/office/drawing/2016/5/9/chartex" xmlns:cx4="http://schemas.microsoft.com/office/drawing/2016/5/10/chartex" xmlns:cx5="http://schemas.microsoft.com/office/drawing/2016/5/11/chartex" xmlns:cx6="http://schemas.microsoft.com/office/drawing/2016/5/12/chartex" xmlns:cx7="http://schemas.microsoft.com/office/drawing/2016/5/13/chartex" xmlns:cx8="http://schemas.microsoft.com/office/drawing/2016/5/14/chartex" xmlns:mc="http://schemas.openxmlformats.org/markup-compatibility/2006" xmlns:m="http://schemas.openxmlformats.org/officeDocument/2006/math" xmlns:aink="http://schemas.microsoft.com/office/drawing/2016/ink" xmlns:am3d="http://schemas.microsoft.com/office/drawing/2017/model3d" xmlns:oel="http://schemas.microsoft.com/office/2019/extlst" xmlns:r="http://schemas.openxmlformats.org/officeDocument/2006/relationships" xmlns:wp14="http://schemas.microsoft.com/office/word/2010/wordprocessingDrawing" xmlns:wp="http://schemas.openxmlformats.org/drawingml/2006/wordprocessingDrawing" xmlns:wpg="http://schemas.microsoft.com/office/word/2010/wordprocessingGroup" xmlns:wpi="http://schemas.microsoft.com/office/word/2010/wordprocessingInk" xmlns:wps="http://schemas.microsoft.com/office/word/2010/wordprocessingShape" xmlns:o="urn:schemas-microsoft-com:office:office" xmlns:v="urn:schemas-microsoft-com:vml" xmlns:w10="urn:schemas-microsoft-com:office:word" xmlns:w="http://schemas.openxmlformats.org/wordprocessingml/2006/main" xmlns:w14="http://schemas.microsoft.com/office/word/2010/wordml" xmlns:w15="http://schemas.microsoft.com/office/word/2012/wordml" xmlns:w16cex="http://schemas.microsoft.com/office/word/2018/wordml/cex" xmlns:w16cid="http://schemas.microsoft.com/office/word/2016/wordml/cid" xmlns:w16="http://schemas.microsoft.com/office/word/2018/wordml" xmlns:w16sdtdh="http://schemas.microsoft.com/office/word/2020/wordml/sdtdatahash" xmlns:w16sdtfl="http://schemas.microsoft.com/office/word/2024/wordml/sdtformatlock" xmlns:w16se="http://schemas.microsoft.com/office/word/2015/wordml/symex" xmlns:w16du="http://schemas.microsoft.com/office/word/2023/wordml/word16du" xmlns:wne="http://schemas.microsoft.com/office/word/2006/wordml" mc:Ignorable="w14 w15 w16se w16cid w16 w16cex w16sdtdh w16sdtfl w16du wp14">
   <w:footnote w:type="separator" w:id="-1">
     <w:p>
       <w:pPr>
@@ -5723,37 +6014,37 @@
 </file>
 
 <file path=word/header1.xml><?xml version="1.0" encoding="utf-8"?>
-<w:hdr xmlns:wpc="http://schemas.microsoft.com/office/word/2010/wordprocessingCanvas" xmlns:cx="http://schemas.microsoft.com/office/drawing/2014/chartex" xmlns:cx1="http://schemas.microsoft.com/office/drawing/2015/9/8/chartex" xmlns:cx2="http://schemas.microsoft.com/office/drawing/2015/10/21/chartex" xmlns:cx3="http://schemas.microsoft.com/office/drawing/2016/5/9/chartex" xmlns:cx4="http://schemas.microsoft.com/office/drawing/2016/5/10/chartex" xmlns:cx5="http://schemas.microsoft.com/office/drawing/2016/5/11/chartex" xmlns:cx6="http://schemas.microsoft.com/office/drawing/2016/5/12/chartex" xmlns:cx7="http://schemas.microsoft.com/office/drawing/2016/5/13/chartex" xmlns:cx8="http://schemas.microsoft.com/office/drawing/2016/5/14/chartex" xmlns:mc="http://schemas.openxmlformats.org/markup-compatibility/2006" xmlns:aink="http://schemas.microsoft.com/office/drawing/2016/ink" xmlns:am3d="http://schemas.microsoft.com/office/drawing/2017/model3d" xmlns:o="urn:schemas-microsoft-com:office:office" xmlns:oel="http://schemas.microsoft.com/office/2019/extlst" xmlns:r="http://schemas.openxmlformats.org/officeDocument/2006/relationships" xmlns:m="http://schemas.openxmlformats.org/officeDocument/2006/math" xmlns:v="urn:schemas-microsoft-com:vml" xmlns:wp14="http://schemas.microsoft.com/office/word/2010/wordprocessingDrawing" xmlns:wp="http://schemas.openxmlformats.org/drawingml/2006/wordprocessingDrawing" xmlns:w10="urn:schemas-microsoft-com:office:word" xmlns:w="http://schemas.openxmlformats.org/wordprocessingml/2006/main" xmlns:w14="http://schemas.microsoft.com/office/word/2010/wordml" xmlns:w15="http://schemas.microsoft.com/office/word/2012/wordml" xmlns:w16cex="http://schemas.microsoft.com/office/word/2018/wordml/cex" xmlns:w16cid="http://schemas.microsoft.com/office/word/2016/wordml/cid" xmlns:w16="http://schemas.microsoft.com/office/word/2018/wordml" xmlns:w16du="http://schemas.microsoft.com/office/word/2023/wordml/word16du" xmlns:w16sdtdh="http://schemas.microsoft.com/office/word/2020/wordml/sdtdatahash" xmlns:w16sdtfl="http://schemas.microsoft.com/office/word/2024/wordml/sdtformatlock" xmlns:w16se="http://schemas.microsoft.com/office/word/2015/wordml/symex" xmlns:wpg="http://schemas.microsoft.com/office/word/2010/wordprocessingGroup" xmlns:wpi="http://schemas.microsoft.com/office/word/2010/wordprocessingInk" xmlns:wne="http://schemas.microsoft.com/office/word/2006/wordml" xmlns:wps="http://schemas.microsoft.com/office/word/2010/wordprocessingShape" mc:Ignorable="w14 w15 w16se w16cid w16 w16cex w16sdtdh w16sdtfl w16du wp14">
+<w:hdr xmlns:wpc="http://schemas.microsoft.com/office/word/2010/wordprocessingCanvas" xmlns:cx="http://schemas.microsoft.com/office/drawing/2014/chartex" xmlns:cx1="http://schemas.microsoft.com/office/drawing/2015/9/8/chartex" xmlns:cx2="http://schemas.microsoft.com/office/drawing/2015/10/21/chartex" xmlns:cx3="http://schemas.microsoft.com/office/drawing/2016/5/9/chartex" xmlns:cx4="http://schemas.microsoft.com/office/drawing/2016/5/10/chartex" xmlns:cx5="http://schemas.microsoft.com/office/drawing/2016/5/11/chartex" xmlns:cx6="http://schemas.microsoft.com/office/drawing/2016/5/12/chartex" xmlns:cx7="http://schemas.microsoft.com/office/drawing/2016/5/13/chartex" xmlns:cx8="http://schemas.microsoft.com/office/drawing/2016/5/14/chartex" xmlns:mc="http://schemas.openxmlformats.org/markup-compatibility/2006" xmlns:m="http://schemas.openxmlformats.org/officeDocument/2006/math" xmlns:aink="http://schemas.microsoft.com/office/drawing/2016/ink" xmlns:am3d="http://schemas.microsoft.com/office/drawing/2017/model3d" xmlns:oel="http://schemas.microsoft.com/office/2019/extlst" xmlns:r="http://schemas.openxmlformats.org/officeDocument/2006/relationships" xmlns:wp14="http://schemas.microsoft.com/office/word/2010/wordprocessingDrawing" xmlns:wp="http://schemas.openxmlformats.org/drawingml/2006/wordprocessingDrawing" xmlns:wpg="http://schemas.microsoft.com/office/word/2010/wordprocessingGroup" xmlns:wpi="http://schemas.microsoft.com/office/word/2010/wordprocessingInk" xmlns:wps="http://schemas.microsoft.com/office/word/2010/wordprocessingShape" xmlns:o="urn:schemas-microsoft-com:office:office" xmlns:v="urn:schemas-microsoft-com:vml" xmlns:w10="urn:schemas-microsoft-com:office:word" xmlns:w="http://schemas.openxmlformats.org/wordprocessingml/2006/main" xmlns:w14="http://schemas.microsoft.com/office/word/2010/wordml" xmlns:w15="http://schemas.microsoft.com/office/word/2012/wordml" xmlns:w16cex="http://schemas.microsoft.com/office/word/2018/wordml/cex" xmlns:w16cid="http://schemas.microsoft.com/office/word/2016/wordml/cid" xmlns:w16="http://schemas.microsoft.com/office/word/2018/wordml" xmlns:w16sdtdh="http://schemas.microsoft.com/office/word/2020/wordml/sdtdatahash" xmlns:w16sdtfl="http://schemas.microsoft.com/office/word/2024/wordml/sdtformatlock" xmlns:w16se="http://schemas.microsoft.com/office/word/2015/wordml/symex" xmlns:w16du="http://schemas.microsoft.com/office/word/2023/wordml/word16du" xmlns:wne="http://schemas.microsoft.com/office/word/2006/wordml" mc:Ignorable="w14 w15 w16se w16cid w16 w16cex w16sdtdh w16sdtfl w16du wp14">
   <w:p>
     <w:pPr>
-      <w:pStyle w:val="Kopfzeile"/>
+      <w:pStyle w:val="Header"/>
     </w:pPr>
   </w:p>
 </w:hdr>
 </file>
 
 <file path=word/header2.xml><?xml version="1.0" encoding="utf-8"?>
-<w:hdr xmlns:wpc="http://schemas.microsoft.com/office/word/2010/wordprocessingCanvas" xmlns:cx="http://schemas.microsoft.com/office/drawing/2014/chartex" xmlns:cx1="http://schemas.microsoft.com/office/drawing/2015/9/8/chartex" xmlns:cx2="http://schemas.microsoft.com/office/drawing/2015/10/21/chartex" xmlns:cx3="http://schemas.microsoft.com/office/drawing/2016/5/9/chartex" xmlns:cx4="http://schemas.microsoft.com/office/drawing/2016/5/10/chartex" xmlns:cx5="http://schemas.microsoft.com/office/drawing/2016/5/11/chartex" xmlns:cx6="http://schemas.microsoft.com/office/drawing/2016/5/12/chartex" xmlns:cx7="http://schemas.microsoft.com/office/drawing/2016/5/13/chartex" xmlns:cx8="http://schemas.microsoft.com/office/drawing/2016/5/14/chartex" xmlns:mc="http://schemas.openxmlformats.org/markup-compatibility/2006" xmlns:aink="http://schemas.microsoft.com/office/drawing/2016/ink" xmlns:am3d="http://schemas.microsoft.com/office/drawing/2017/model3d" xmlns:o="urn:schemas-microsoft-com:office:office" xmlns:oel="http://schemas.microsoft.com/office/2019/extlst" xmlns:r="http://schemas.openxmlformats.org/officeDocument/2006/relationships" xmlns:m="http://schemas.openxmlformats.org/officeDocument/2006/math" xmlns:v="urn:schemas-microsoft-com:vml" xmlns:wp14="http://schemas.microsoft.com/office/word/2010/wordprocessingDrawing" xmlns:wp="http://schemas.openxmlformats.org/drawingml/2006/wordprocessingDrawing" xmlns:w10="urn:schemas-microsoft-com:office:word" xmlns:w="http://schemas.openxmlformats.org/wordprocessingml/2006/main" xmlns:w14="http://schemas.microsoft.com/office/word/2010/wordml" xmlns:w15="http://schemas.microsoft.com/office/word/2012/wordml" xmlns:w16cex="http://schemas.microsoft.com/office/word/2018/wordml/cex" xmlns:w16cid="http://schemas.microsoft.com/office/word/2016/wordml/cid" xmlns:w16="http://schemas.microsoft.com/office/word/2018/wordml" xmlns:w16du="http://schemas.microsoft.com/office/word/2023/wordml/word16du" xmlns:w16sdtdh="http://schemas.microsoft.com/office/word/2020/wordml/sdtdatahash" xmlns:w16sdtfl="http://schemas.microsoft.com/office/word/2024/wordml/sdtformatlock" xmlns:w16se="http://schemas.microsoft.com/office/word/2015/wordml/symex" xmlns:wpg="http://schemas.microsoft.com/office/word/2010/wordprocessingGroup" xmlns:wpi="http://schemas.microsoft.com/office/word/2010/wordprocessingInk" xmlns:wne="http://schemas.microsoft.com/office/word/2006/wordml" xmlns:wps="http://schemas.microsoft.com/office/word/2010/wordprocessingShape" mc:Ignorable="w14 w15 w16se w16cid w16 w16cex w16sdtdh w16sdtfl w16du wp14">
+<w:hdr xmlns:wpc="http://schemas.microsoft.com/office/word/2010/wordprocessingCanvas" xmlns:cx="http://schemas.microsoft.com/office/drawing/2014/chartex" xmlns:cx1="http://schemas.microsoft.com/office/drawing/2015/9/8/chartex" xmlns:cx2="http://schemas.microsoft.com/office/drawing/2015/10/21/chartex" xmlns:cx3="http://schemas.microsoft.com/office/drawing/2016/5/9/chartex" xmlns:cx4="http://schemas.microsoft.com/office/drawing/2016/5/10/chartex" xmlns:cx5="http://schemas.microsoft.com/office/drawing/2016/5/11/chartex" xmlns:cx6="http://schemas.microsoft.com/office/drawing/2016/5/12/chartex" xmlns:cx7="http://schemas.microsoft.com/office/drawing/2016/5/13/chartex" xmlns:cx8="http://schemas.microsoft.com/office/drawing/2016/5/14/chartex" xmlns:mc="http://schemas.openxmlformats.org/markup-compatibility/2006" xmlns:m="http://schemas.openxmlformats.org/officeDocument/2006/math" xmlns:aink="http://schemas.microsoft.com/office/drawing/2016/ink" xmlns:am3d="http://schemas.microsoft.com/office/drawing/2017/model3d" xmlns:oel="http://schemas.microsoft.com/office/2019/extlst" xmlns:r="http://schemas.openxmlformats.org/officeDocument/2006/relationships" xmlns:wp14="http://schemas.microsoft.com/office/word/2010/wordprocessingDrawing" xmlns:wp="http://schemas.openxmlformats.org/drawingml/2006/wordprocessingDrawing" xmlns:wpg="http://schemas.microsoft.com/office/word/2010/wordprocessingGroup" xmlns:wpi="http://schemas.microsoft.com/office/word/2010/wordprocessingInk" xmlns:wps="http://schemas.microsoft.com/office/word/2010/wordprocessingShape" xmlns:o="urn:schemas-microsoft-com:office:office" xmlns:v="urn:schemas-microsoft-com:vml" xmlns:w10="urn:schemas-microsoft-com:office:word" xmlns:w="http://schemas.openxmlformats.org/wordprocessingml/2006/main" xmlns:w14="http://schemas.microsoft.com/office/word/2010/wordml" xmlns:w15="http://schemas.microsoft.com/office/word/2012/wordml" xmlns:w16cex="http://schemas.microsoft.com/office/word/2018/wordml/cex" xmlns:w16cid="http://schemas.microsoft.com/office/word/2016/wordml/cid" xmlns:w16="http://schemas.microsoft.com/office/word/2018/wordml" xmlns:w16sdtdh="http://schemas.microsoft.com/office/word/2020/wordml/sdtdatahash" xmlns:w16sdtfl="http://schemas.microsoft.com/office/word/2024/wordml/sdtformatlock" xmlns:w16se="http://schemas.microsoft.com/office/word/2015/wordml/symex" xmlns:w16du="http://schemas.microsoft.com/office/word/2023/wordml/word16du" xmlns:wne="http://schemas.microsoft.com/office/word/2006/wordml" mc:Ignorable="w14 w15 w16se w16cid w16 w16cex w16sdtdh w16sdtfl w16du wp14">
   <w:p>
     <w:pPr>
-      <w:pStyle w:val="Kopfzeile"/>
+      <w:pStyle w:val="Header"/>
     </w:pPr>
   </w:p>
 </w:hdr>
 </file>
 
 <file path=word/header3.xml><?xml version="1.0" encoding="utf-8"?>
-<w:hdr xmlns:wpc="http://schemas.microsoft.com/office/word/2010/wordprocessingCanvas" xmlns:cx="http://schemas.microsoft.com/office/drawing/2014/chartex" xmlns:cx1="http://schemas.microsoft.com/office/drawing/2015/9/8/chartex" xmlns:cx2="http://schemas.microsoft.com/office/drawing/2015/10/21/chartex" xmlns:cx3="http://schemas.microsoft.com/office/drawing/2016/5/9/chartex" xmlns:cx4="http://schemas.microsoft.com/office/drawing/2016/5/10/chartex" xmlns:cx5="http://schemas.microsoft.com/office/drawing/2016/5/11/chartex" xmlns:cx6="http://schemas.microsoft.com/office/drawing/2016/5/12/chartex" xmlns:cx7="http://schemas.microsoft.com/office/drawing/2016/5/13/chartex" xmlns:cx8="http://schemas.microsoft.com/office/drawing/2016/5/14/chartex" xmlns:mc="http://schemas.openxmlformats.org/markup-compatibility/2006" xmlns:aink="http://schemas.microsoft.com/office/drawing/2016/ink" xmlns:am3d="http://schemas.microsoft.com/office/drawing/2017/model3d" xmlns:o="urn:schemas-microsoft-com:office:office" xmlns:oel="http://schemas.microsoft.com/office/2019/extlst" xmlns:r="http://schemas.openxmlformats.org/officeDocument/2006/relationships" xmlns:m="http://schemas.openxmlformats.org/officeDocument/2006/math" xmlns:v="urn:schemas-microsoft-com:vml" xmlns:wp14="http://schemas.microsoft.com/office/word/2010/wordprocessingDrawing" xmlns:wp="http://schemas.openxmlformats.org/drawingml/2006/wordprocessingDrawing" xmlns:w10="urn:schemas-microsoft-com:office:word" xmlns:w="http://schemas.openxmlformats.org/wordprocessingml/2006/main" xmlns:w14="http://schemas.microsoft.com/office/word/2010/wordml" xmlns:w15="http://schemas.microsoft.com/office/word/2012/wordml" xmlns:w16cex="http://schemas.microsoft.com/office/word/2018/wordml/cex" xmlns:w16cid="http://schemas.microsoft.com/office/word/2016/wordml/cid" xmlns:w16="http://schemas.microsoft.com/office/word/2018/wordml" xmlns:w16du="http://schemas.microsoft.com/office/word/2023/wordml/word16du" xmlns:w16sdtdh="http://schemas.microsoft.com/office/word/2020/wordml/sdtdatahash" xmlns:w16sdtfl="http://schemas.microsoft.com/office/word/2024/wordml/sdtformatlock" xmlns:w16se="http://schemas.microsoft.com/office/word/2015/wordml/symex" xmlns:wpg="http://schemas.microsoft.com/office/word/2010/wordprocessingGroup" xmlns:wpi="http://schemas.microsoft.com/office/word/2010/wordprocessingInk" xmlns:wne="http://schemas.microsoft.com/office/word/2006/wordml" xmlns:wps="http://schemas.microsoft.com/office/word/2010/wordprocessingShape" mc:Ignorable="w14 w15 w16se w16cid w16 w16cex w16sdtdh w16sdtfl w16du wp14">
+<w:hdr xmlns:wpc="http://schemas.microsoft.com/office/word/2010/wordprocessingCanvas" xmlns:cx="http://schemas.microsoft.com/office/drawing/2014/chartex" xmlns:cx1="http://schemas.microsoft.com/office/drawing/2015/9/8/chartex" xmlns:cx2="http://schemas.microsoft.com/office/drawing/2015/10/21/chartex" xmlns:cx3="http://schemas.microsoft.com/office/drawing/2016/5/9/chartex" xmlns:cx4="http://schemas.microsoft.com/office/drawing/2016/5/10/chartex" xmlns:cx5="http://schemas.microsoft.com/office/drawing/2016/5/11/chartex" xmlns:cx6="http://schemas.microsoft.com/office/drawing/2016/5/12/chartex" xmlns:cx7="http://schemas.microsoft.com/office/drawing/2016/5/13/chartex" xmlns:cx8="http://schemas.microsoft.com/office/drawing/2016/5/14/chartex" xmlns:mc="http://schemas.openxmlformats.org/markup-compatibility/2006" xmlns:m="http://schemas.openxmlformats.org/officeDocument/2006/math" xmlns:aink="http://schemas.microsoft.com/office/drawing/2016/ink" xmlns:am3d="http://schemas.microsoft.com/office/drawing/2017/model3d" xmlns:oel="http://schemas.microsoft.com/office/2019/extlst" xmlns:r="http://schemas.openxmlformats.org/officeDocument/2006/relationships" xmlns:wp14="http://schemas.microsoft.com/office/word/2010/wordprocessingDrawing" xmlns:wp="http://schemas.openxmlformats.org/drawingml/2006/wordprocessingDrawing" xmlns:wpg="http://schemas.microsoft.com/office/word/2010/wordprocessingGroup" xmlns:wpi="http://schemas.microsoft.com/office/word/2010/wordprocessingInk" xmlns:wps="http://schemas.microsoft.com/office/word/2010/wordprocessingShape" xmlns:o="urn:schemas-microsoft-com:office:office" xmlns:v="urn:schemas-microsoft-com:vml" xmlns:w10="urn:schemas-microsoft-com:office:word" xmlns:w="http://schemas.openxmlformats.org/wordprocessingml/2006/main" xmlns:w14="http://schemas.microsoft.com/office/word/2010/wordml" xmlns:w15="http://schemas.microsoft.com/office/word/2012/wordml" xmlns:w16cex="http://schemas.microsoft.com/office/word/2018/wordml/cex" xmlns:w16cid="http://schemas.microsoft.com/office/word/2016/wordml/cid" xmlns:w16="http://schemas.microsoft.com/office/word/2018/wordml" xmlns:w16sdtdh="http://schemas.microsoft.com/office/word/2020/wordml/sdtdatahash" xmlns:w16sdtfl="http://schemas.microsoft.com/office/word/2024/wordml/sdtformatlock" xmlns:w16se="http://schemas.microsoft.com/office/word/2015/wordml/symex" xmlns:w16du="http://schemas.microsoft.com/office/word/2023/wordml/word16du" xmlns:wne="http://schemas.microsoft.com/office/word/2006/wordml" mc:Ignorable="w14 w15 w16se w16cid w16 w16cex w16sdtdh w16sdtfl w16du wp14">
   <w:p>
     <w:pPr>
-      <w:pStyle w:val="Kopfzeile"/>
+      <w:pStyle w:val="Header"/>
     </w:pPr>
   </w:p>
 </w:hdr>
 </file>
 
 <file path=word/numbering.xml><?xml version="1.0" encoding="utf-8"?>
-<w:numbering xmlns:wpc="http://schemas.microsoft.com/office/word/2010/wordprocessingCanvas" xmlns:cx="http://schemas.microsoft.com/office/drawing/2014/chartex" xmlns:cx1="http://schemas.microsoft.com/office/drawing/2015/9/8/chartex" xmlns:cx2="http://schemas.microsoft.com/office/drawing/2015/10/21/chartex" xmlns:cx3="http://schemas.microsoft.com/office/drawing/2016/5/9/chartex" xmlns:cx4="http://schemas.microsoft.com/office/drawing/2016/5/10/chartex" xmlns:cx5="http://schemas.microsoft.com/office/drawing/2016/5/11/chartex" xmlns:cx6="http://schemas.microsoft.com/office/drawing/2016/5/12/chartex" xmlns:cx7="http://schemas.microsoft.com/office/drawing/2016/5/13/chartex" xmlns:cx8="http://schemas.microsoft.com/office/drawing/2016/5/14/chartex" xmlns:mc="http://schemas.openxmlformats.org/markup-compatibility/2006" xmlns:aink="http://schemas.microsoft.com/office/drawing/2016/ink" xmlns:am3d="http://schemas.microsoft.com/office/drawing/2017/model3d" xmlns:o="urn:schemas-microsoft-com:office:office" xmlns:oel="http://schemas.microsoft.com/office/2019/extlst" xmlns:r="http://schemas.openxmlformats.org/officeDocument/2006/relationships" xmlns:m="http://schemas.openxmlformats.org/officeDocument/2006/math" xmlns:v="urn:schemas-microsoft-com:vml" xmlns:wp14="http://schemas.microsoft.com/office/word/2010/wordprocessingDrawing" xmlns:wp="http://schemas.openxmlformats.org/drawingml/2006/wordprocessingDrawing" xmlns:w10="urn:schemas-microsoft-com:office:word" xmlns:w="http://schemas.openxmlformats.org/wordprocessingml/2006/main" xmlns:w14="http://schemas.microsoft.com/office/word/2010/wordml" xmlns:w15="http://schemas.microsoft.com/office/word/2012/wordml" xmlns:w16cex="http://schemas.microsoft.com/office/word/2018/wordml/cex" xmlns:w16cid="http://schemas.microsoft.com/office/word/2016/wordml/cid" xmlns:w16="http://schemas.microsoft.com/office/word/2018/wordml" xmlns:w16du="http://schemas.microsoft.com/office/word/2023/wordml/word16du" xmlns:w16sdtdh="http://schemas.microsoft.com/office/word/2020/wordml/sdtdatahash" xmlns:w16sdtfl="http://schemas.microsoft.com/office/word/2024/wordml/sdtformatlock" xmlns:w16se="http://schemas.microsoft.com/office/word/2015/wordml/symex" xmlns:wpg="http://schemas.microsoft.com/office/word/2010/wordprocessingGroup" xmlns:wpi="http://schemas.microsoft.com/office/word/2010/wordprocessingInk" xmlns:wne="http://schemas.microsoft.com/office/word/2006/wordml" xmlns:wps="http://schemas.microsoft.com/office/word/2010/wordprocessingShape" mc:Ignorable="w14 w15 w16se w16cid w16 w16cex w16sdtdh w16sdtfl w16du wp14">
+<w:numbering xmlns:wpc="http://schemas.microsoft.com/office/word/2010/wordprocessingCanvas" xmlns:cx="http://schemas.microsoft.com/office/drawing/2014/chartex" xmlns:cx1="http://schemas.microsoft.com/office/drawing/2015/9/8/chartex" xmlns:cx2="http://schemas.microsoft.com/office/drawing/2015/10/21/chartex" xmlns:cx3="http://schemas.microsoft.com/office/drawing/2016/5/9/chartex" xmlns:cx4="http://schemas.microsoft.com/office/drawing/2016/5/10/chartex" xmlns:cx5="http://schemas.microsoft.com/office/drawing/2016/5/11/chartex" xmlns:cx6="http://schemas.microsoft.com/office/drawing/2016/5/12/chartex" xmlns:cx7="http://schemas.microsoft.com/office/drawing/2016/5/13/chartex" xmlns:cx8="http://schemas.microsoft.com/office/drawing/2016/5/14/chartex" xmlns:mc="http://schemas.openxmlformats.org/markup-compatibility/2006" xmlns:m="http://schemas.openxmlformats.org/officeDocument/2006/math" xmlns:aink="http://schemas.microsoft.com/office/drawing/2016/ink" xmlns:am3d="http://schemas.microsoft.com/office/drawing/2017/model3d" xmlns:oel="http://schemas.microsoft.com/office/2019/extlst" xmlns:r="http://schemas.openxmlformats.org/officeDocument/2006/relationships" xmlns:wp14="http://schemas.microsoft.com/office/word/2010/wordprocessingDrawing" xmlns:wp="http://schemas.openxmlformats.org/drawingml/2006/wordprocessingDrawing" xmlns:wpg="http://schemas.microsoft.com/office/word/2010/wordprocessingGroup" xmlns:wpi="http://schemas.microsoft.com/office/word/2010/wordprocessingInk" xmlns:wps="http://schemas.microsoft.com/office/word/2010/wordprocessingShape" xmlns:o="urn:schemas-microsoft-com:office:office" xmlns:v="urn:schemas-microsoft-com:vml" xmlns:w10="urn:schemas-microsoft-com:office:word" xmlns:w="http://schemas.openxmlformats.org/wordprocessingml/2006/main" xmlns:w14="http://schemas.microsoft.com/office/word/2010/wordml" xmlns:w15="http://schemas.microsoft.com/office/word/2012/wordml" xmlns:w16cex="http://schemas.microsoft.com/office/word/2018/wordml/cex" xmlns:w16cid="http://schemas.microsoft.com/office/word/2016/wordml/cid" xmlns:w16="http://schemas.microsoft.com/office/word/2018/wordml" xmlns:w16sdtdh="http://schemas.microsoft.com/office/word/2020/wordml/sdtdatahash" xmlns:w16sdtfl="http://schemas.microsoft.com/office/word/2024/wordml/sdtformatlock" xmlns:w16se="http://schemas.microsoft.com/office/word/2015/wordml/symex" xmlns:w16du="http://schemas.microsoft.com/office/word/2023/wordml/word16du" xmlns:wne="http://schemas.microsoft.com/office/word/2006/wordml" mc:Ignorable="w14 w15 w16se w16cid w16 w16cex w16sdtdh w16sdtfl w16du wp14">
   <w:abstractNum w:abstractNumId="0" w15:restartNumberingAfterBreak="0">
     <w:nsid w:val="192548C2"/>
     <w:multiLevelType w:val="multilevel"/>
@@ -6299,7 +6590,7 @@
     <w:lvl w:ilvl="0">
       <w:start w:val="1"/>
       <w:numFmt w:val="decimal"/>
-      <w:pStyle w:val="berschrift1"/>
+      <w:pStyle w:val="Heading1"/>
       <w:lvlText w:val="%1"/>
       <w:lvlJc w:val="left"/>
       <w:pPr>
@@ -6466,7 +6757,7 @@
 </file>
 
 <file path=word/styles.xml><?xml version="1.0" encoding="utf-8"?>
-<w:styles xmlns:mc="http://schemas.openxmlformats.org/markup-compatibility/2006" xmlns:r="http://schemas.openxmlformats.org/officeDocument/2006/relationships" xmlns:w="http://schemas.openxmlformats.org/wordprocessingml/2006/main" xmlns:w14="http://schemas.microsoft.com/office/word/2010/wordml" xmlns:w15="http://schemas.microsoft.com/office/word/2012/wordml" xmlns:w16cex="http://schemas.microsoft.com/office/word/2018/wordml/cex" xmlns:w16cid="http://schemas.microsoft.com/office/word/2016/wordml/cid" xmlns:w16="http://schemas.microsoft.com/office/word/2018/wordml" xmlns:w16du="http://schemas.microsoft.com/office/word/2023/wordml/word16du" xmlns:w16sdtdh="http://schemas.microsoft.com/office/word/2020/wordml/sdtdatahash" xmlns:w16sdtfl="http://schemas.microsoft.com/office/word/2024/wordml/sdtformatlock" xmlns:w16se="http://schemas.microsoft.com/office/word/2015/wordml/symex" mc:Ignorable="w14 w15 w16se w16cid w16 w16cex w16sdtdh w16sdtfl w16du">
+<w:styles xmlns:mc="http://schemas.openxmlformats.org/markup-compatibility/2006" xmlns:r="http://schemas.openxmlformats.org/officeDocument/2006/relationships" xmlns:w="http://schemas.openxmlformats.org/wordprocessingml/2006/main" xmlns:w14="http://schemas.microsoft.com/office/word/2010/wordml" xmlns:w15="http://schemas.microsoft.com/office/word/2012/wordml" xmlns:w16cex="http://schemas.microsoft.com/office/word/2018/wordml/cex" xmlns:w16cid="http://schemas.microsoft.com/office/word/2016/wordml/cid" xmlns:w16="http://schemas.microsoft.com/office/word/2018/wordml" xmlns:w16sdtdh="http://schemas.microsoft.com/office/word/2020/wordml/sdtdatahash" xmlns:w16sdtfl="http://schemas.microsoft.com/office/word/2024/wordml/sdtformatlock" xmlns:w16se="http://schemas.microsoft.com/office/word/2015/wordml/symex" xmlns:w16du="http://schemas.microsoft.com/office/word/2023/wordml/word16du" mc:Ignorable="w14 w15 w16se w16cid w16 w16cex w16sdtdh w16sdtfl w16du">
   <w:docDefaults>
     <w:rPrDefault>
       <w:rPr>
@@ -6860,15 +7151,15 @@
     <w:lsdException w:name="Unresolved Mention" w:semiHidden="1" w:unhideWhenUsed="1"/>
     <w:lsdException w:name="Smart Link" w:semiHidden="1" w:unhideWhenUsed="1"/>
   </w:latentStyles>
-  <w:style w:type="paragraph" w:default="1" w:styleId="Standard">
+  <w:style w:type="paragraph" w:default="1" w:styleId="Normal">
     <w:name w:val="Normal"/>
     <w:qFormat/>
   </w:style>
-  <w:style w:type="paragraph" w:styleId="berschrift1">
+  <w:style w:type="paragraph" w:styleId="Heading1">
     <w:name w:val="heading 1"/>
-    <w:basedOn w:val="Standard"/>
-    <w:next w:val="Standard"/>
-    <w:link w:val="berschrift1Zchn"/>
+    <w:basedOn w:val="Normal"/>
+    <w:next w:val="Normal"/>
+    <w:link w:val="Heading1Char"/>
     <w:uiPriority w:val="9"/>
     <w:qFormat/>
     <w:rsid w:val="009730E4"/>
@@ -6889,13 +7180,13 @@
       <w:lang w:eastAsia="en-GB"/>
     </w:rPr>
   </w:style>
-  <w:style w:type="character" w:default="1" w:styleId="Absatz-Standardschriftart">
+  <w:style w:type="character" w:default="1" w:styleId="DefaultParagraphFont">
     <w:name w:val="Default Paragraph Font"/>
     <w:uiPriority w:val="1"/>
     <w:semiHidden/>
     <w:unhideWhenUsed/>
   </w:style>
-  <w:style w:type="table" w:default="1" w:styleId="NormaleTabelle">
+  <w:style w:type="table" w:default="1" w:styleId="TableNormal">
     <w:name w:val="Normal Table"/>
     <w:uiPriority w:val="99"/>
     <w:semiHidden/>
@@ -6910,16 +7201,16 @@
       </w:tblCellMar>
     </w:tblPr>
   </w:style>
-  <w:style w:type="numbering" w:default="1" w:styleId="KeineListe">
+  <w:style w:type="numbering" w:default="1" w:styleId="NoList">
     <w:name w:val="No List"/>
     <w:uiPriority w:val="99"/>
     <w:semiHidden/>
     <w:unhideWhenUsed/>
   </w:style>
-  <w:style w:type="paragraph" w:styleId="Kommentartext">
+  <w:style w:type="paragraph" w:styleId="CommentText">
     <w:name w:val="annotation text"/>
-    <w:basedOn w:val="Standard"/>
-    <w:link w:val="KommentartextZchn"/>
+    <w:basedOn w:val="Normal"/>
+    <w:link w:val="CommentTextChar"/>
     <w:uiPriority w:val="99"/>
     <w:semiHidden/>
     <w:unhideWhenUsed/>
@@ -6933,10 +7224,10 @@
       <w:lang w:eastAsia="en-GB"/>
     </w:rPr>
   </w:style>
-  <w:style w:type="character" w:customStyle="1" w:styleId="KommentartextZchn">
-    <w:name w:val="Kommentartext Zchn"/>
-    <w:basedOn w:val="Absatz-Standardschriftart"/>
-    <w:link w:val="Kommentartext"/>
+  <w:style w:type="character" w:customStyle="1" w:styleId="CommentTextChar">
+    <w:name w:val="Comment Text Char"/>
+    <w:basedOn w:val="DefaultParagraphFont"/>
+    <w:link w:val="CommentText"/>
     <w:uiPriority w:val="99"/>
     <w:semiHidden/>
     <w:rPr>
@@ -6946,9 +7237,9 @@
       <w:lang w:eastAsia="en-GB"/>
     </w:rPr>
   </w:style>
-  <w:style w:type="character" w:styleId="Kommentarzeichen">
+  <w:style w:type="character" w:styleId="CommentReference">
     <w:name w:val="annotation reference"/>
-    <w:basedOn w:val="Absatz-Standardschriftart"/>
+    <w:basedOn w:val="DefaultParagraphFont"/>
     <w:uiPriority w:val="99"/>
     <w:semiHidden/>
     <w:unhideWhenUsed/>
@@ -6957,9 +7248,9 @@
       <w:szCs w:val="16"/>
     </w:rPr>
   </w:style>
-  <w:style w:type="table" w:styleId="Tabellenraster">
+  <w:style w:type="table" w:styleId="TableGrid">
     <w:name w:val="Table Grid"/>
-    <w:basedOn w:val="NormaleTabelle"/>
+    <w:basedOn w:val="TableNormal"/>
     <w:uiPriority w:val="59"/>
     <w:pPr>
       <w:spacing w:after="0" w:line="240" w:lineRule="auto"/>
@@ -6978,10 +7269,10 @@
       </w:tblBorders>
     </w:tblPr>
   </w:style>
-  <w:style w:type="paragraph" w:styleId="Kopfzeile">
+  <w:style w:type="paragraph" w:styleId="Header">
     <w:name w:val="header"/>
-    <w:basedOn w:val="Standard"/>
-    <w:link w:val="KopfzeileZchn"/>
+    <w:basedOn w:val="Normal"/>
+    <w:link w:val="HeaderChar"/>
     <w:uiPriority w:val="99"/>
     <w:unhideWhenUsed/>
     <w:pPr>
@@ -6996,20 +7287,20 @@
       <w:lang w:eastAsia="en-GB"/>
     </w:rPr>
   </w:style>
-  <w:style w:type="character" w:customStyle="1" w:styleId="KopfzeileZchn">
-    <w:name w:val="Kopfzeile Zchn"/>
-    <w:basedOn w:val="Absatz-Standardschriftart"/>
-    <w:link w:val="Kopfzeile"/>
+  <w:style w:type="character" w:customStyle="1" w:styleId="HeaderChar">
+    <w:name w:val="Header Char"/>
+    <w:basedOn w:val="DefaultParagraphFont"/>
+    <w:link w:val="Header"/>
     <w:uiPriority w:val="99"/>
     <w:rPr>
       <w:rFonts w:ascii="Arial" w:eastAsia="Arial" w:hAnsi="Arial" w:cs="Arial"/>
       <w:lang w:eastAsia="en-GB"/>
     </w:rPr>
   </w:style>
-  <w:style w:type="paragraph" w:styleId="Fuzeile">
+  <w:style w:type="paragraph" w:styleId="Footer">
     <w:name w:val="footer"/>
-    <w:basedOn w:val="Standard"/>
-    <w:link w:val="FuzeileZchn"/>
+    <w:basedOn w:val="Normal"/>
+    <w:link w:val="FooterChar"/>
     <w:uiPriority w:val="99"/>
     <w:unhideWhenUsed/>
     <w:pPr>
@@ -7024,10 +7315,10 @@
       <w:lang w:eastAsia="en-GB"/>
     </w:rPr>
   </w:style>
-  <w:style w:type="character" w:customStyle="1" w:styleId="FuzeileZchn">
-    <w:name w:val="Fußzeile Zchn"/>
-    <w:basedOn w:val="Absatz-Standardschriftart"/>
-    <w:link w:val="Fuzeile"/>
+  <w:style w:type="character" w:customStyle="1" w:styleId="FooterChar">
+    <w:name w:val="Footer Char"/>
+    <w:basedOn w:val="DefaultParagraphFont"/>
+    <w:link w:val="Footer"/>
     <w:uiPriority w:val="99"/>
     <w:rPr>
       <w:rFonts w:ascii="Arial" w:eastAsia="Arial" w:hAnsi="Arial" w:cs="Arial"/>
@@ -7036,8 +7327,8 @@
   </w:style>
   <w:style w:type="table" w:customStyle="1" w:styleId="TableGrid1">
     <w:name w:val="Table Grid1"/>
-    <w:basedOn w:val="NormaleTabelle"/>
-    <w:next w:val="Tabellenraster"/>
+    <w:basedOn w:val="TableNormal"/>
+    <w:next w:val="TableGrid"/>
     <w:uiPriority w:val="59"/>
     <w:pPr>
       <w:spacing w:after="0" w:line="240" w:lineRule="auto"/>
@@ -7053,10 +7344,10 @@
       </w:tblBorders>
     </w:tblPr>
   </w:style>
-  <w:style w:type="paragraph" w:styleId="Sprechblasentext">
+  <w:style w:type="paragraph" w:styleId="BalloonText">
     <w:name w:val="Balloon Text"/>
-    <w:basedOn w:val="Standard"/>
-    <w:link w:val="SprechblasentextZchn"/>
+    <w:basedOn w:val="Normal"/>
+    <w:link w:val="BalloonTextChar"/>
     <w:uiPriority w:val="99"/>
     <w:semiHidden/>
     <w:unhideWhenUsed/>
@@ -7069,10 +7360,10 @@
       <w:szCs w:val="18"/>
     </w:rPr>
   </w:style>
-  <w:style w:type="character" w:customStyle="1" w:styleId="SprechblasentextZchn">
-    <w:name w:val="Sprechblasentext Zchn"/>
-    <w:basedOn w:val="Absatz-Standardschriftart"/>
-    <w:link w:val="Sprechblasentext"/>
+  <w:style w:type="character" w:customStyle="1" w:styleId="BalloonTextChar">
+    <w:name w:val="Balloon Text Char"/>
+    <w:basedOn w:val="DefaultParagraphFont"/>
+    <w:link w:val="BalloonText"/>
     <w:uiPriority w:val="99"/>
     <w:semiHidden/>
     <w:rPr>
@@ -7081,18 +7372,18 @@
       <w:szCs w:val="18"/>
     </w:rPr>
   </w:style>
-  <w:style w:type="character" w:styleId="Platzhaltertext">
+  <w:style w:type="character" w:styleId="PlaceholderText">
     <w:name w:val="Placeholder Text"/>
-    <w:basedOn w:val="Absatz-Standardschriftart"/>
+    <w:basedOn w:val="DefaultParagraphFont"/>
     <w:uiPriority w:val="99"/>
     <w:semiHidden/>
     <w:rPr>
       <w:color w:val="808080"/>
     </w:rPr>
   </w:style>
-  <w:style w:type="paragraph" w:styleId="StandardWeb">
+  <w:style w:type="paragraph" w:styleId="NormalWeb">
     <w:name w:val="Normal (Web)"/>
-    <w:basedOn w:val="Standard"/>
+    <w:basedOn w:val="Normal"/>
     <w:uiPriority w:val="99"/>
     <w:unhideWhenUsed/>
     <w:pPr>
@@ -7105,9 +7396,9 @@
       <w:lang w:eastAsia="en-GB"/>
     </w:rPr>
   </w:style>
-  <w:style w:type="paragraph" w:styleId="Listenabsatz">
+  <w:style w:type="paragraph" w:styleId="ListParagraph">
     <w:name w:val="List Paragraph"/>
-    <w:basedOn w:val="Standard"/>
+    <w:basedOn w:val="Normal"/>
     <w:uiPriority w:val="34"/>
     <w:qFormat/>
     <w:pPr>
@@ -7115,11 +7406,11 @@
       <w:contextualSpacing/>
     </w:pPr>
   </w:style>
-  <w:style w:type="paragraph" w:styleId="Kommentarthema">
+  <w:style w:type="paragraph" w:styleId="CommentSubject">
     <w:name w:val="annotation subject"/>
-    <w:basedOn w:val="Kommentartext"/>
-    <w:next w:val="Kommentartext"/>
-    <w:link w:val="KommentarthemaZchn"/>
+    <w:basedOn w:val="CommentText"/>
+    <w:next w:val="CommentText"/>
+    <w:link w:val="CommentSubjectChar"/>
     <w:uiPriority w:val="99"/>
     <w:semiHidden/>
     <w:unhideWhenUsed/>
@@ -7133,10 +7424,10 @@
       <w:lang w:eastAsia="en-US"/>
     </w:rPr>
   </w:style>
-  <w:style w:type="character" w:customStyle="1" w:styleId="KommentarthemaZchn">
-    <w:name w:val="Kommentarthema Zchn"/>
-    <w:basedOn w:val="KommentartextZchn"/>
-    <w:link w:val="Kommentarthema"/>
+  <w:style w:type="character" w:customStyle="1" w:styleId="CommentSubjectChar">
+    <w:name w:val="Comment Subject Char"/>
+    <w:basedOn w:val="CommentTextChar"/>
+    <w:link w:val="CommentSubject"/>
     <w:uiPriority w:val="99"/>
     <w:semiHidden/>
     <w:rPr>
@@ -7148,7 +7439,7 @@
       <w:lang w:eastAsia="en-GB"/>
     </w:rPr>
   </w:style>
-  <w:style w:type="paragraph" w:styleId="berarbeitung">
+  <w:style w:type="paragraph" w:styleId="Revision">
     <w:name w:val="Revision"/>
     <w:hidden/>
     <w:uiPriority w:val="99"/>
@@ -7159,8 +7450,8 @@
   </w:style>
   <w:style w:type="table" w:customStyle="1" w:styleId="TableGrid2">
     <w:name w:val="Table Grid2"/>
-    <w:basedOn w:val="NormaleTabelle"/>
-    <w:next w:val="Tabellenraster"/>
+    <w:basedOn w:val="TableNormal"/>
+    <w:next w:val="TableGrid"/>
     <w:uiPriority w:val="59"/>
     <w:pPr>
       <w:spacing w:after="0" w:line="240" w:lineRule="auto"/>
@@ -7181,8 +7472,8 @@
   </w:style>
   <w:style w:type="table" w:customStyle="1" w:styleId="TableGrid11">
     <w:name w:val="Table Grid11"/>
-    <w:basedOn w:val="NormaleTabelle"/>
-    <w:next w:val="Tabellenraster"/>
+    <w:basedOn w:val="TableNormal"/>
+    <w:next w:val="TableGrid"/>
     <w:uiPriority w:val="59"/>
     <w:pPr>
       <w:spacing w:after="0" w:line="240" w:lineRule="auto"/>
@@ -7200,7 +7491,7 @@
   </w:style>
   <w:style w:type="character" w:styleId="Hyperlink">
     <w:name w:val="Hyperlink"/>
-    <w:basedOn w:val="Absatz-Standardschriftart"/>
+    <w:basedOn w:val="DefaultParagraphFont"/>
     <w:uiPriority w:val="99"/>
     <w:unhideWhenUsed/>
     <w:rPr>
@@ -7210,7 +7501,7 @@
   </w:style>
   <w:style w:type="character" w:customStyle="1" w:styleId="UnresolvedMention1">
     <w:name w:val="Unresolved Mention1"/>
-    <w:basedOn w:val="Absatz-Standardschriftart"/>
+    <w:basedOn w:val="DefaultParagraphFont"/>
     <w:uiPriority w:val="99"/>
     <w:semiHidden/>
     <w:unhideWhenUsed/>
@@ -7219,9 +7510,9 @@
       <w:shd w:val="clear" w:color="auto" w:fill="E1DFDD"/>
     </w:rPr>
   </w:style>
-  <w:style w:type="character" w:styleId="BesuchterLink">
+  <w:style w:type="character" w:styleId="FollowedHyperlink">
     <w:name w:val="FollowedHyperlink"/>
-    <w:basedOn w:val="Absatz-Standardschriftart"/>
+    <w:basedOn w:val="DefaultParagraphFont"/>
     <w:uiPriority w:val="99"/>
     <w:semiHidden/>
     <w:unhideWhenUsed/>
@@ -7230,9 +7521,9 @@
       <w:u w:val="single"/>
     </w:rPr>
   </w:style>
-  <w:style w:type="character" w:styleId="NichtaufgelsteErwhnung">
+  <w:style w:type="character" w:styleId="UnresolvedMention">
     <w:name w:val="Unresolved Mention"/>
-    <w:basedOn w:val="Absatz-Standardschriftart"/>
+    <w:basedOn w:val="DefaultParagraphFont"/>
     <w:uiPriority w:val="99"/>
     <w:semiHidden/>
     <w:unhideWhenUsed/>
@@ -7242,11 +7533,11 @@
       <w:shd w:val="clear" w:color="auto" w:fill="E1DFDD"/>
     </w:rPr>
   </w:style>
-  <w:style w:type="paragraph" w:styleId="Titel">
+  <w:style w:type="paragraph" w:styleId="Title">
     <w:name w:val="Title"/>
-    <w:basedOn w:val="Standard"/>
-    <w:next w:val="Standard"/>
-    <w:link w:val="TitelZchn"/>
+    <w:basedOn w:val="Normal"/>
+    <w:next w:val="Normal"/>
+    <w:link w:val="TitleChar"/>
     <w:uiPriority w:val="10"/>
     <w:qFormat/>
     <w:rsid w:val="009730E4"/>
@@ -7260,10 +7551,10 @@
       <w:sz w:val="28"/>
     </w:rPr>
   </w:style>
-  <w:style w:type="character" w:customStyle="1" w:styleId="TitelZchn">
-    <w:name w:val="Titel Zchn"/>
-    <w:basedOn w:val="Absatz-Standardschriftart"/>
-    <w:link w:val="Titel"/>
+  <w:style w:type="character" w:customStyle="1" w:styleId="TitleChar">
+    <w:name w:val="Title Char"/>
+    <w:basedOn w:val="DefaultParagraphFont"/>
+    <w:link w:val="Title"/>
     <w:uiPriority w:val="10"/>
     <w:rsid w:val="009730E4"/>
     <w:rPr>
@@ -7273,10 +7564,10 @@
       <w:sz w:val="28"/>
     </w:rPr>
   </w:style>
-  <w:style w:type="character" w:customStyle="1" w:styleId="berschrift1Zchn">
-    <w:name w:val="Überschrift 1 Zchn"/>
-    <w:basedOn w:val="Absatz-Standardschriftart"/>
-    <w:link w:val="berschrift1"/>
+  <w:style w:type="character" w:customStyle="1" w:styleId="Heading1Char">
+    <w:name w:val="Heading 1 Char"/>
+    <w:basedOn w:val="DefaultParagraphFont"/>
+    <w:link w:val="Heading1"/>
     <w:uiPriority w:val="9"/>
     <w:rsid w:val="009730E4"/>
     <w:rPr>
@@ -7291,7 +7582,7 @@
 </file>
 
 <file path=word/glossary/document.xml><?xml version="1.0" encoding="utf-8"?>
-<w:glossaryDocument xmlns:wpc="http://schemas.microsoft.com/office/word/2010/wordprocessingCanvas" xmlns:cx="http://schemas.microsoft.com/office/drawing/2014/chartex" xmlns:cx1="http://schemas.microsoft.com/office/drawing/2015/9/8/chartex" xmlns:cx2="http://schemas.microsoft.com/office/drawing/2015/10/21/chartex" xmlns:cx3="http://schemas.microsoft.com/office/drawing/2016/5/9/chartex" xmlns:cx4="http://schemas.microsoft.com/office/drawing/2016/5/10/chartex" xmlns:cx5="http://schemas.microsoft.com/office/drawing/2016/5/11/chartex" xmlns:cx6="http://schemas.microsoft.com/office/drawing/2016/5/12/chartex" xmlns:cx7="http://schemas.microsoft.com/office/drawing/2016/5/13/chartex" xmlns:cx8="http://schemas.microsoft.com/office/drawing/2016/5/14/chartex" xmlns:mc="http://schemas.openxmlformats.org/markup-compatibility/2006" xmlns:aink="http://schemas.microsoft.com/office/drawing/2016/ink" xmlns:am3d="http://schemas.microsoft.com/office/drawing/2017/model3d" xmlns:o="urn:schemas-microsoft-com:office:office" xmlns:oel="http://schemas.microsoft.com/office/2019/extlst" xmlns:r="http://schemas.openxmlformats.org/officeDocument/2006/relationships" xmlns:m="http://schemas.openxmlformats.org/officeDocument/2006/math" xmlns:v="urn:schemas-microsoft-com:vml" xmlns:wp14="http://schemas.microsoft.com/office/word/2010/wordprocessingDrawing" xmlns:wp="http://schemas.openxmlformats.org/drawingml/2006/wordprocessingDrawing" xmlns:w10="urn:schemas-microsoft-com:office:word" xmlns:w="http://schemas.openxmlformats.org/wordprocessingml/2006/main" xmlns:w14="http://schemas.microsoft.com/office/word/2010/wordml" xmlns:w15="http://schemas.microsoft.com/office/word/2012/wordml" xmlns:w16cex="http://schemas.microsoft.com/office/word/2018/wordml/cex" xmlns:w16cid="http://schemas.microsoft.com/office/word/2016/wordml/cid" xmlns:w16="http://schemas.microsoft.com/office/word/2018/wordml" xmlns:w16du="http://schemas.microsoft.com/office/word/2023/wordml/word16du" xmlns:w16sdtdh="http://schemas.microsoft.com/office/word/2020/wordml/sdtdatahash" xmlns:w16sdtfl="http://schemas.microsoft.com/office/word/2024/wordml/sdtformatlock" xmlns:w16se="http://schemas.microsoft.com/office/word/2015/wordml/symex" xmlns:wpg="http://schemas.microsoft.com/office/word/2010/wordprocessingGroup" xmlns:wpi="http://schemas.microsoft.com/office/word/2010/wordprocessingInk" xmlns:wne="http://schemas.microsoft.com/office/word/2006/wordml" xmlns:wps="http://schemas.microsoft.com/office/word/2010/wordprocessingShape" mc:Ignorable="w14 w15 w16se w16cid w16 w16cex w16sdtdh w16sdtfl w16du wp14">
+<w:glossaryDocument xmlns:wpc="http://schemas.microsoft.com/office/word/2010/wordprocessingCanvas" xmlns:cx="http://schemas.microsoft.com/office/drawing/2014/chartex" xmlns:cx1="http://schemas.microsoft.com/office/drawing/2015/9/8/chartex" xmlns:cx2="http://schemas.microsoft.com/office/drawing/2015/10/21/chartex" xmlns:cx3="http://schemas.microsoft.com/office/drawing/2016/5/9/chartex" xmlns:cx4="http://schemas.microsoft.com/office/drawing/2016/5/10/chartex" xmlns:cx5="http://schemas.microsoft.com/office/drawing/2016/5/11/chartex" xmlns:cx6="http://schemas.microsoft.com/office/drawing/2016/5/12/chartex" xmlns:cx7="http://schemas.microsoft.com/office/drawing/2016/5/13/chartex" xmlns:cx8="http://schemas.microsoft.com/office/drawing/2016/5/14/chartex" xmlns:mc="http://schemas.openxmlformats.org/markup-compatibility/2006" xmlns:m="http://schemas.openxmlformats.org/officeDocument/2006/math" xmlns:aink="http://schemas.microsoft.com/office/drawing/2016/ink" xmlns:am3d="http://schemas.microsoft.com/office/drawing/2017/model3d" xmlns:oel="http://schemas.microsoft.com/office/2019/extlst" xmlns:r="http://schemas.openxmlformats.org/officeDocument/2006/relationships" xmlns:wp14="http://schemas.microsoft.com/office/word/2010/wordprocessingDrawing" xmlns:wp="http://schemas.openxmlformats.org/drawingml/2006/wordprocessingDrawing" xmlns:wpg="http://schemas.microsoft.com/office/word/2010/wordprocessingGroup" xmlns:wpi="http://schemas.microsoft.com/office/word/2010/wordprocessingInk" xmlns:wps="http://schemas.microsoft.com/office/word/2010/wordprocessingShape" xmlns:o="urn:schemas-microsoft-com:office:office" xmlns:v="urn:schemas-microsoft-com:vml" xmlns:w10="urn:schemas-microsoft-com:office:word" xmlns:w="http://schemas.openxmlformats.org/wordprocessingml/2006/main" xmlns:w14="http://schemas.microsoft.com/office/word/2010/wordml" xmlns:w15="http://schemas.microsoft.com/office/word/2012/wordml" xmlns:w16cex="http://schemas.microsoft.com/office/word/2018/wordml/cex" xmlns:w16cid="http://schemas.microsoft.com/office/word/2016/wordml/cid" xmlns:w16="http://schemas.microsoft.com/office/word/2018/wordml" xmlns:w16sdtdh="http://schemas.microsoft.com/office/word/2020/wordml/sdtdatahash" xmlns:w16sdtfl="http://schemas.microsoft.com/office/word/2024/wordml/sdtformatlock" xmlns:w16se="http://schemas.microsoft.com/office/word/2015/wordml/symex" xmlns:w16du="http://schemas.microsoft.com/office/word/2023/wordml/word16du" xmlns:wne="http://schemas.microsoft.com/office/word/2006/wordml" mc:Ignorable="w14 w15 w16se w16cid w16 w16cex w16sdtdh w16sdtfl w16du wp14">
   <w:docParts>
     <w:docPart>
       <w:docPartPr>
@@ -7485,12 +7776,76 @@
         </w:p>
       </w:docPartBody>
     </w:docPart>
+    <w:docPart>
+      <w:docPartPr>
+        <w:name w:val="D4B64FC99ADFBB419A2DDC634B72360A"/>
+        <w:category>
+          <w:name w:val="General"/>
+          <w:gallery w:val="placeholder"/>
+        </w:category>
+        <w:types>
+          <w:type w:val="bbPlcHdr"/>
+        </w:types>
+        <w:behaviors>
+          <w:behavior w:val="content"/>
+        </w:behaviors>
+        <w:guid w:val="{FB8899FA-2F77-6D4F-98EE-9F439D75AC6F}"/>
+      </w:docPartPr>
+      <w:docPartBody>
+        <w:p>
+          <w:pPr>
+            <w:pStyle w:val="D4B64FC99ADFBB419A2DDC634B72360A"/>
+          </w:pPr>
+          <w:r>
+            <w:rPr>
+              <w:rFonts w:ascii="Tahoma" w:eastAsia="Cambria" w:hAnsi="Tahoma" w:cs="Tahoma"/>
+              <w:color w:val="808080"/>
+              <w:sz w:val="16"/>
+              <w:szCs w:val="16"/>
+            </w:rPr>
+            <w:t>Click here to enter text.</w:t>
+          </w:r>
+        </w:p>
+      </w:docPartBody>
+    </w:docPart>
+    <w:docPart>
+      <w:docPartPr>
+        <w:name w:val="5B6B9D38A2F0BD47955FD4A8C8E9BEBD"/>
+        <w:category>
+          <w:name w:val="General"/>
+          <w:gallery w:val="placeholder"/>
+        </w:category>
+        <w:types>
+          <w:type w:val="bbPlcHdr"/>
+        </w:types>
+        <w:behaviors>
+          <w:behavior w:val="content"/>
+        </w:behaviors>
+        <w:guid w:val="{837C63A3-0FEC-2C4E-B0CB-07EAD8574D33}"/>
+      </w:docPartPr>
+      <w:docPartBody>
+        <w:p>
+          <w:pPr>
+            <w:pStyle w:val="5B6B9D38A2F0BD47955FD4A8C8E9BEBD"/>
+          </w:pPr>
+          <w:r>
+            <w:rPr>
+              <w:rFonts w:ascii="Tahoma" w:eastAsia="Cambria" w:hAnsi="Tahoma" w:cs="Tahoma"/>
+              <w:color w:val="808080"/>
+              <w:sz w:val="16"/>
+              <w:szCs w:val="16"/>
+            </w:rPr>
+            <w:t>Click here to enter text.</w:t>
+          </w:r>
+        </w:p>
+      </w:docPartBody>
+    </w:docPart>
   </w:docParts>
 </w:glossaryDocument>
 </file>
 
 <file path=word/glossary/fontTable.xml><?xml version="1.0" encoding="utf-8"?>
-<w:fonts xmlns:mc="http://schemas.openxmlformats.org/markup-compatibility/2006" xmlns:r="http://schemas.openxmlformats.org/officeDocument/2006/relationships" xmlns:w="http://schemas.openxmlformats.org/wordprocessingml/2006/main" xmlns:w14="http://schemas.microsoft.com/office/word/2010/wordml" xmlns:w15="http://schemas.microsoft.com/office/word/2012/wordml" xmlns:w16cex="http://schemas.microsoft.com/office/word/2018/wordml/cex" xmlns:w16cid="http://schemas.microsoft.com/office/word/2016/wordml/cid" xmlns:w16="http://schemas.microsoft.com/office/word/2018/wordml" xmlns:w16du="http://schemas.microsoft.com/office/word/2023/wordml/word16du" xmlns:w16sdtdh="http://schemas.microsoft.com/office/word/2020/wordml/sdtdatahash" xmlns:w16sdtfl="http://schemas.microsoft.com/office/word/2024/wordml/sdtformatlock" xmlns:w16se="http://schemas.microsoft.com/office/word/2015/wordml/symex" mc:Ignorable="w14 w15 w16se w16cid w16 w16cex w16sdtdh w16sdtfl w16du">
+<w:fonts xmlns:mc="http://schemas.openxmlformats.org/markup-compatibility/2006" xmlns:r="http://schemas.openxmlformats.org/officeDocument/2006/relationships" xmlns:w="http://schemas.openxmlformats.org/wordprocessingml/2006/main" xmlns:w14="http://schemas.microsoft.com/office/word/2010/wordml" xmlns:w15="http://schemas.microsoft.com/office/word/2012/wordml" xmlns:w16cex="http://schemas.microsoft.com/office/word/2018/wordml/cex" xmlns:w16cid="http://schemas.microsoft.com/office/word/2016/wordml/cid" xmlns:w16="http://schemas.microsoft.com/office/word/2018/wordml" xmlns:w16sdtdh="http://schemas.microsoft.com/office/word/2020/wordml/sdtdatahash" xmlns:w16sdtfl="http://schemas.microsoft.com/office/word/2024/wordml/sdtformatlock" xmlns:w16se="http://schemas.microsoft.com/office/word/2015/wordml/symex" xmlns:w16du="http://schemas.microsoft.com/office/word/2023/wordml/word16du" mc:Ignorable="w14 w15 w16se w16cid w16 w16cex w16sdtdh w16sdtfl w16du">
   <w:font w:name="Calibri">
     <w:panose1 w:val="020F0502020204030204"/>
     <w:charset w:val="00"/>
@@ -7526,15 +7881,9 @@
     <w:pitch w:val="variable"/>
     <w:sig w:usb0="E00006FF" w:usb1="420024FF" w:usb2="02000000" w:usb3="00000000" w:csb0="0000019F" w:csb1="00000000"/>
   </w:font>
-  <w:font w:name="Tahoma">
-    <w:panose1 w:val="020B0604030504040204"/>
-    <w:charset w:val="00"/>
-    <w:family w:val="swiss"/>
-    <w:pitch w:val="variable"/>
-    <w:sig w:usb0="E1002EFF" w:usb1="C000605B" w:usb2="00000029" w:usb3="00000000" w:csb0="000101FF" w:csb1="00000000"/>
-  </w:font>
   <w:font w:name="DengXian Light">
     <w:altName w:val="等线 Light"/>
+    <w:panose1 w:val="02010600030101010101"/>
     <w:charset w:val="86"/>
     <w:family w:val="auto"/>
     <w:pitch w:val="variable"/>
@@ -7556,12 +7905,21 @@
     <w:sig w:usb0="A00002BF" w:usb1="38CF7CFA" w:usb2="00000016" w:usb3="00000000" w:csb0="0004000F" w:csb1="00000000"/>
   </w:font>
   <w:font w:name="Aptos">
+    <w:panose1 w:val="020B0004020202020204"/>
     <w:charset w:val="00"/>
     <w:family w:val="swiss"/>
     <w:pitch w:val="variable"/>
     <w:sig w:usb0="20000287" w:usb1="00000003" w:usb2="00000000" w:usb3="00000000" w:csb0="0000019F" w:csb1="00000000"/>
   </w:font>
+  <w:font w:name="Tahoma">
+    <w:panose1 w:val="020B0604030504040204"/>
+    <w:charset w:val="00"/>
+    <w:family w:val="swiss"/>
+    <w:pitch w:val="variable"/>
+    <w:sig w:usb0="E1002EFF" w:usb1="C000605B" w:usb2="00000029" w:usb3="00000000" w:csb0="000101FF" w:csb1="00000000"/>
+  </w:font>
   <w:font w:name="Aptos Display">
+    <w:panose1 w:val="020B0004020202020204"/>
     <w:charset w:val="00"/>
     <w:family w:val="swiss"/>
     <w:pitch w:val="variable"/>
@@ -7571,7 +7929,7 @@
 </file>
 
 <file path=word/glossary/settings.xml><?xml version="1.0" encoding="utf-8"?>
-<w:settings xmlns:mc="http://schemas.openxmlformats.org/markup-compatibility/2006" xmlns:o="urn:schemas-microsoft-com:office:office" xmlns:r="http://schemas.openxmlformats.org/officeDocument/2006/relationships" xmlns:m="http://schemas.openxmlformats.org/officeDocument/2006/math" xmlns:v="urn:schemas-microsoft-com:vml" xmlns:w10="urn:schemas-microsoft-com:office:word" xmlns:w="http://schemas.openxmlformats.org/wordprocessingml/2006/main" xmlns:w14="http://schemas.microsoft.com/office/word/2010/wordml" xmlns:w15="http://schemas.microsoft.com/office/word/2012/wordml" xmlns:w16cex="http://schemas.microsoft.com/office/word/2018/wordml/cex" xmlns:w16cid="http://schemas.microsoft.com/office/word/2016/wordml/cid" xmlns:w16="http://schemas.microsoft.com/office/word/2018/wordml" xmlns:w16du="http://schemas.microsoft.com/office/word/2023/wordml/word16du" xmlns:w16sdtdh="http://schemas.microsoft.com/office/word/2020/wordml/sdtdatahash" xmlns:w16sdtfl="http://schemas.microsoft.com/office/word/2024/wordml/sdtformatlock" xmlns:w16se="http://schemas.microsoft.com/office/word/2015/wordml/symex" xmlns:sl="http://schemas.openxmlformats.org/schemaLibrary/2006/main" mc:Ignorable="w14 w15 w16se w16cid w16 w16cex w16sdtdh w16sdtfl w16du">
+<w:settings xmlns:mc="http://schemas.openxmlformats.org/markup-compatibility/2006" xmlns:m="http://schemas.openxmlformats.org/officeDocument/2006/math" xmlns:r="http://schemas.openxmlformats.org/officeDocument/2006/relationships" xmlns:sl="http://schemas.openxmlformats.org/schemaLibrary/2006/main" xmlns:o="urn:schemas-microsoft-com:office:office" xmlns:v="urn:schemas-microsoft-com:vml" xmlns:w10="urn:schemas-microsoft-com:office:word" xmlns:w="http://schemas.openxmlformats.org/wordprocessingml/2006/main" xmlns:w14="http://schemas.microsoft.com/office/word/2010/wordml" xmlns:w15="http://schemas.microsoft.com/office/word/2012/wordml" xmlns:w16cex="http://schemas.microsoft.com/office/word/2018/wordml/cex" xmlns:w16cid="http://schemas.microsoft.com/office/word/2016/wordml/cid" xmlns:w16="http://schemas.microsoft.com/office/word/2018/wordml" xmlns:w16sdtdh="http://schemas.microsoft.com/office/word/2020/wordml/sdtdatahash" xmlns:w16sdtfl="http://schemas.microsoft.com/office/word/2024/wordml/sdtformatlock" xmlns:w16se="http://schemas.microsoft.com/office/word/2015/wordml/symex" xmlns:w16du="http://schemas.microsoft.com/office/word/2023/wordml/word16du" mc:Ignorable="w14 w15 w16se w16cid w16 w16cex w16sdtdh w16sdtfl w16du">
   <w:view w:val="normal"/>
   <w:revisionView w:formatting="0"/>
   <w:defaultTabStop w:val="720"/>
@@ -7631,6 +7989,7 @@
     <w:rsid w:val="0081740C"/>
     <w:rsid w:val="00836B87"/>
     <w:rsid w:val="008536BE"/>
+    <w:rsid w:val="00873303"/>
     <w:rsid w:val="008A4576"/>
     <w:rsid w:val="00955F26"/>
     <w:rsid w:val="00987156"/>
@@ -7648,11 +8007,13 @@
     <w:rsid w:val="00D31A45"/>
     <w:rsid w:val="00D62CDF"/>
     <w:rsid w:val="00DD4A01"/>
+    <w:rsid w:val="00DE2050"/>
     <w:rsid w:val="00E05723"/>
     <w:rsid w:val="00E42740"/>
     <w:rsid w:val="00E832A6"/>
     <w:rsid w:val="00EA0548"/>
     <w:rsid w:val="00ED7D11"/>
+    <w:rsid w:val="00F44E44"/>
     <w:rsid w:val="00F72056"/>
     <w:rsid w:val="00F75CDB"/>
     <w:rsid w:val="00F76A54"/>
@@ -7675,14 +8036,14 @@
   </m:mathPr>
   <w:themeFontLang w:val="en-GB" w:eastAsia="zh-CN" w:bidi="ar-SA"/>
   <w:clrSchemeMapping w:bg1="light1" w:t1="dark1" w:bg2="light2" w:t2="dark2" w:accent1="accent1" w:accent2="accent2" w:accent3="accent3" w:accent4="accent4" w:accent5="accent5" w:accent6="accent6" w:hyperlink="hyperlink" w:followedHyperlink="followedHyperlink"/>
-  <w:decimalSymbol w:val=","/>
-  <w:listSeparator w:val=";"/>
+  <w:decimalSymbol w:val="."/>
+  <w:listSeparator w:val=","/>
   <w15:chartTrackingRefBased/>
 </w:settings>
 </file>
 
 <file path=word/glossary/styles.xml><?xml version="1.0" encoding="utf-8"?>
-<w:styles xmlns:mc="http://schemas.openxmlformats.org/markup-compatibility/2006" xmlns:r="http://schemas.openxmlformats.org/officeDocument/2006/relationships" xmlns:w="http://schemas.openxmlformats.org/wordprocessingml/2006/main" xmlns:w14="http://schemas.microsoft.com/office/word/2010/wordml" xmlns:w15="http://schemas.microsoft.com/office/word/2012/wordml" xmlns:w16cex="http://schemas.microsoft.com/office/word/2018/wordml/cex" xmlns:w16cid="http://schemas.microsoft.com/office/word/2016/wordml/cid" xmlns:w16="http://schemas.microsoft.com/office/word/2018/wordml" xmlns:w16du="http://schemas.microsoft.com/office/word/2023/wordml/word16du" xmlns:w16sdtdh="http://schemas.microsoft.com/office/word/2020/wordml/sdtdatahash" xmlns:w16sdtfl="http://schemas.microsoft.com/office/word/2024/wordml/sdtformatlock" xmlns:w16se="http://schemas.microsoft.com/office/word/2015/wordml/symex" mc:Ignorable="w14 w15 w16se w16cid w16 w16cex w16sdtdh w16sdtfl w16du">
+<w:styles xmlns:mc="http://schemas.openxmlformats.org/markup-compatibility/2006" xmlns:r="http://schemas.openxmlformats.org/officeDocument/2006/relationships" xmlns:w="http://schemas.openxmlformats.org/wordprocessingml/2006/main" xmlns:w14="http://schemas.microsoft.com/office/word/2010/wordml" xmlns:w15="http://schemas.microsoft.com/office/word/2012/wordml" xmlns:w16cex="http://schemas.microsoft.com/office/word/2018/wordml/cex" xmlns:w16cid="http://schemas.microsoft.com/office/word/2016/wordml/cid" xmlns:w16="http://schemas.microsoft.com/office/word/2018/wordml" xmlns:w16sdtdh="http://schemas.microsoft.com/office/word/2020/wordml/sdtdatahash" xmlns:w16sdtfl="http://schemas.microsoft.com/office/word/2024/wordml/sdtformatlock" xmlns:w16se="http://schemas.microsoft.com/office/word/2015/wordml/symex" xmlns:w16du="http://schemas.microsoft.com/office/word/2023/wordml/word16du" mc:Ignorable="w14 w15 w16se w16cid w16 w16cex w16sdtdh w16sdtfl w16du">
   <w:docDefaults>
     <w:rPrDefault>
       <w:rPr>
@@ -8076,17 +8437,17 @@
     <w:lsdException w:name="Unresolved Mention" w:semiHidden="1" w:unhideWhenUsed="1"/>
     <w:lsdException w:name="Smart Link" w:semiHidden="1" w:unhideWhenUsed="1"/>
   </w:latentStyles>
-  <w:style w:type="paragraph" w:default="1" w:styleId="Standard">
+  <w:style w:type="paragraph" w:default="1" w:styleId="Normal">
     <w:name w:val="Normal"/>
     <w:qFormat/>
   </w:style>
-  <w:style w:type="character" w:default="1" w:styleId="Absatz-Standardschriftart">
+  <w:style w:type="character" w:default="1" w:styleId="DefaultParagraphFont">
     <w:name w:val="Default Paragraph Font"/>
     <w:uiPriority w:val="1"/>
     <w:semiHidden/>
     <w:unhideWhenUsed/>
   </w:style>
-  <w:style w:type="table" w:default="1" w:styleId="NormaleTabelle">
+  <w:style w:type="table" w:default="1" w:styleId="TableNormal">
     <w:name w:val="Normal Table"/>
     <w:uiPriority w:val="99"/>
     <w:semiHidden/>
@@ -8101,15 +8462,15 @@
       </w:tblCellMar>
     </w:tblPr>
   </w:style>
-  <w:style w:type="numbering" w:default="1" w:styleId="KeineListe">
+  <w:style w:type="numbering" w:default="1" w:styleId="NoList">
     <w:name w:val="No List"/>
     <w:uiPriority w:val="99"/>
     <w:semiHidden/>
     <w:unhideWhenUsed/>
   </w:style>
-  <w:style w:type="character" w:styleId="Platzhaltertext">
+  <w:style w:type="character" w:styleId="PlaceholderText">
     <w:name w:val="Placeholder Text"/>
-    <w:basedOn w:val="Absatz-Standardschriftart"/>
+    <w:basedOn w:val="DefaultParagraphFont"/>
     <w:uiPriority w:val="99"/>
     <w:semiHidden/>
     <w:rsid w:val="00D319AF"/>
@@ -8155,11 +8516,39 @@
   <w:style w:type="paragraph" w:customStyle="1" w:styleId="22A007FA09B0416FAE2AB143EF3D80A9">
     <w:name w:val="22A007FA09B0416FAE2AB143EF3D80A9"/>
   </w:style>
+  <w:style w:type="paragraph" w:customStyle="1" w:styleId="D4B64FC99ADFBB419A2DDC634B72360A">
+    <w:name w:val="D4B64FC99ADFBB419A2DDC634B72360A"/>
+    <w:rsid w:val="00873303"/>
+    <w:pPr>
+      <w:spacing w:line="278" w:lineRule="auto"/>
+    </w:pPr>
+    <w:rPr>
+      <w:kern w:val="2"/>
+      <w:sz w:val="24"/>
+      <w:szCs w:val="24"/>
+      <w:lang w:val="en-US" w:eastAsia="en-US"/>
+      <w14:ligatures w14:val="standardContextual"/>
+    </w:rPr>
+  </w:style>
+  <w:style w:type="paragraph" w:customStyle="1" w:styleId="5B6B9D38A2F0BD47955FD4A8C8E9BEBD">
+    <w:name w:val="5B6B9D38A2F0BD47955FD4A8C8E9BEBD"/>
+    <w:rsid w:val="00873303"/>
+    <w:pPr>
+      <w:spacing w:line="278" w:lineRule="auto"/>
+    </w:pPr>
+    <w:rPr>
+      <w:kern w:val="2"/>
+      <w:sz w:val="24"/>
+      <w:szCs w:val="24"/>
+      <w:lang w:val="en-US" w:eastAsia="en-US"/>
+      <w14:ligatures w14:val="standardContextual"/>
+    </w:rPr>
+  </w:style>
 </w:styles>
 </file>
 
 <file path=word/glossary/webSettings.xml><?xml version="1.0" encoding="utf-8"?>
-<w:webSettings xmlns:mc="http://schemas.openxmlformats.org/markup-compatibility/2006" xmlns:r="http://schemas.openxmlformats.org/officeDocument/2006/relationships" xmlns:w="http://schemas.openxmlformats.org/wordprocessingml/2006/main" xmlns:w14="http://schemas.microsoft.com/office/word/2010/wordml" xmlns:w15="http://schemas.microsoft.com/office/word/2012/wordml" xmlns:w16cex="http://schemas.microsoft.com/office/word/2018/wordml/cex" xmlns:w16cid="http://schemas.microsoft.com/office/word/2016/wordml/cid" xmlns:w16="http://schemas.microsoft.com/office/word/2018/wordml" xmlns:w16du="http://schemas.microsoft.com/office/word/2023/wordml/word16du" xmlns:w16sdtdh="http://schemas.microsoft.com/office/word/2020/wordml/sdtdatahash" xmlns:w16sdtfl="http://schemas.microsoft.com/office/word/2024/wordml/sdtformatlock" xmlns:w16se="http://schemas.microsoft.com/office/word/2015/wordml/symex" mc:Ignorable="w14 w15 w16se w16cid w16 w16cex w16sdtdh w16sdtfl w16du">
+<w:webSettings xmlns:mc="http://schemas.openxmlformats.org/markup-compatibility/2006" xmlns:r="http://schemas.openxmlformats.org/officeDocument/2006/relationships" xmlns:w="http://schemas.openxmlformats.org/wordprocessingml/2006/main" xmlns:w14="http://schemas.microsoft.com/office/word/2010/wordml" xmlns:w15="http://schemas.microsoft.com/office/word/2012/wordml" xmlns:w16cex="http://schemas.microsoft.com/office/word/2018/wordml/cex" xmlns:w16cid="http://schemas.microsoft.com/office/word/2016/wordml/cid" xmlns:w16="http://schemas.microsoft.com/office/word/2018/wordml" xmlns:w16sdtdh="http://schemas.microsoft.com/office/word/2020/wordml/sdtdatahash" xmlns:w16sdtfl="http://schemas.microsoft.com/office/word/2024/wordml/sdtformatlock" xmlns:w16se="http://schemas.microsoft.com/office/word/2015/wordml/symex" xmlns:w16du="http://schemas.microsoft.com/office/word/2023/wordml/word16du" mc:Ignorable="w14 w15 w16se w16cid w16 w16cex w16sdtdh w16sdtfl w16du">
   <w:optimizeForBrowser/>
   <w:allowPNG/>
 </w:webSettings>
@@ -8461,6 +8850,14 @@
 </file>
 
 <file path=customXml/item1.xml><?xml version="1.0" encoding="utf-8"?>
+<Session xmlns="http://schemas.business-integrity.com/dealbuilder/2006/answers"/>
+</file>
+
+<file path=customXml/item2.xml><?xml version="1.0" encoding="utf-8"?>
+<Dictionary xmlns="http://schemas.business-integrity.com/dealbuilder/2006/dictionary" SavedByVersion="10.15.67.1" MinimumVersion="7.2.0.0"/>
+</file>
+
+<file path=customXml/item3.xml><?xml version="1.0" encoding="utf-8"?>
 <p:properties xmlns:p="http://schemas.microsoft.com/office/2006/metadata/properties" xmlns:xsi="http://www.w3.org/2001/XMLSchema-instance" xmlns:pc="http://schemas.microsoft.com/office/infopath/2007/PartnerControls">
   <documentManagement>
     <lcf76f155ced4ddcb4097134ff3c332f xmlns="d9c60541-b97e-4531-bd5d-c95af8ba043f">
@@ -8471,24 +8868,7 @@
 </p:properties>
 </file>
 
-<file path=customXml/item2.xml><?xml version="1.0" encoding="utf-8"?>
-<Dictionary xmlns="http://schemas.business-integrity.com/dealbuilder/2006/dictionary" SavedByVersion="10.15.67.1" MinimumVersion="7.2.0.0"/>
-</file>
-
-<file path=customXml/item3.xml><?xml version="1.0" encoding="utf-8"?>
-<Session xmlns="http://schemas.business-integrity.com/dealbuilder/2006/answers"/>
-</file>
-
 <file path=customXml/item4.xml><?xml version="1.0" encoding="utf-8"?>
-<?mso-contentType ?>
-<FormTemplates xmlns="http://schemas.microsoft.com/sharepoint/v3/contenttype/forms">
-  <Display>DocumentLibraryForm</Display>
-  <Edit>DocumentLibraryForm</Edit>
-  <New>DocumentLibraryForm</New>
-</FormTemplates>
-</file>
-
-<file path=customXml/item5.xml><?xml version="1.0" encoding="utf-8"?>
 <ct:contentTypeSchema xmlns:ct="http://schemas.microsoft.com/office/2006/metadata/contentType" xmlns:ma="http://schemas.microsoft.com/office/2006/metadata/properties/metaAttributes" ct:_="" ma:_="" ma:contentTypeName="Document" ma:contentTypeID="0x0101001C9D4C717E432B45829341C6EB4E0512" ma:contentTypeVersion="13" ma:contentTypeDescription="Create a new document." ma:contentTypeScope="" ma:versionID="7b087f34b0bb847110e4c2aaa6404b0d">
   <xsd:schema xmlns:xsd="http://www.w3.org/2001/XMLSchema" xmlns:xs="http://www.w3.org/2001/XMLSchema" xmlns:p="http://schemas.microsoft.com/office/2006/metadata/properties" xmlns:ns2="d9c60541-b97e-4531-bd5d-c95af8ba043f" xmlns:ns3="2298e316-5395-4ea8-8620-f0b006294e0b" targetNamespace="http://schemas.microsoft.com/office/2006/metadata/properties" ma:root="true" ma:fieldsID="5ad2acb738f07d01074449fb9ab80a03" ns2:_="" ns3:_="">
     <xsd:import namespace="d9c60541-b97e-4531-bd5d-c95af8ba043f"/>
@@ -8695,13 +9075,19 @@
 </ct:contentTypeSchema>
 </file>
 
+<file path=customXml/item5.xml><?xml version="1.0" encoding="utf-8"?>
+<?mso-contentType ?>
+<FormTemplates xmlns="http://schemas.microsoft.com/sharepoint/v3/contenttype/forms">
+  <Display>DocumentLibraryForm</Display>
+  <Edit>DocumentLibraryForm</Edit>
+  <New>DocumentLibraryForm</New>
+</FormTemplates>
+</file>
+
 <file path=customXml/itemProps1.xml><?xml version="1.0" encoding="utf-8"?>
-<ds:datastoreItem xmlns:ds="http://schemas.openxmlformats.org/officeDocument/2006/customXml" ds:itemID="{929CE202-2D19-40A4-A251-1D47D9450DC6}">
+<ds:datastoreItem xmlns:ds="http://schemas.openxmlformats.org/officeDocument/2006/customXml" ds:itemID="{B17D58BB-A77C-4368-A0BC-DEE26B6B6221}">
   <ds:schemaRefs>
-    <ds:schemaRef ds:uri="http://schemas.microsoft.com/office/2006/metadata/properties"/>
-    <ds:schemaRef ds:uri="http://schemas.microsoft.com/office/infopath/2007/PartnerControls"/>
-    <ds:schemaRef ds:uri="d9c60541-b97e-4531-bd5d-c95af8ba043f"/>
-    <ds:schemaRef ds:uri="2298e316-5395-4ea8-8620-f0b006294e0b"/>
+    <ds:schemaRef ds:uri="http://schemas.business-integrity.com/dealbuilder/2006/answers"/>
   </ds:schemaRefs>
 </ds:datastoreItem>
 </file>
@@ -8715,22 +9101,17 @@
 </file>
 
 <file path=customXml/itemProps3.xml><?xml version="1.0" encoding="utf-8"?>
-<ds:datastoreItem xmlns:ds="http://schemas.openxmlformats.org/officeDocument/2006/customXml" ds:itemID="{B17D58BB-A77C-4368-A0BC-DEE26B6B6221}">
+<ds:datastoreItem xmlns:ds="http://schemas.openxmlformats.org/officeDocument/2006/customXml" ds:itemID="{929CE202-2D19-40A4-A251-1D47D9450DC6}">
   <ds:schemaRefs>
-    <ds:schemaRef ds:uri="http://schemas.business-integrity.com/dealbuilder/2006/answers"/>
+    <ds:schemaRef ds:uri="http://schemas.microsoft.com/office/2006/metadata/properties"/>
+    <ds:schemaRef ds:uri="http://schemas.microsoft.com/office/infopath/2007/PartnerControls"/>
+    <ds:schemaRef ds:uri="d9c60541-b97e-4531-bd5d-c95af8ba043f"/>
+    <ds:schemaRef ds:uri="2298e316-5395-4ea8-8620-f0b006294e0b"/>
   </ds:schemaRefs>
 </ds:datastoreItem>
 </file>
 
 <file path=customXml/itemProps4.xml><?xml version="1.0" encoding="utf-8"?>
-<ds:datastoreItem xmlns:ds="http://schemas.openxmlformats.org/officeDocument/2006/customXml" ds:itemID="{C92DB59C-A80D-4402-A564-50EA110A9AE6}">
-  <ds:schemaRefs>
-    <ds:schemaRef ds:uri="http://schemas.microsoft.com/sharepoint/v3/contenttype/forms"/>
-  </ds:schemaRefs>
-</ds:datastoreItem>
-</file>
-
-<file path=customXml/itemProps5.xml><?xml version="1.0" encoding="utf-8"?>
 <ds:datastoreItem xmlns:ds="http://schemas.openxmlformats.org/officeDocument/2006/customXml" ds:itemID="{6EEAB147-0A35-45A3-8D92-DFB5407796DE}">
   <ds:schemaRefs>
     <ds:schemaRef ds:uri="http://schemas.microsoft.com/office/2006/metadata/contentType"/>
@@ -8747,4 +9128,12 @@
     <ds:schemaRef ds:uri="http://schemas.microsoft.com/internal/obd"/>
   </ds:schemaRefs>
 </ds:datastoreItem>
+</file>
+
+<file path=customXml/itemProps5.xml><?xml version="1.0" encoding="utf-8"?>
+<ds:datastoreItem xmlns:ds="http://schemas.openxmlformats.org/officeDocument/2006/customXml" ds:itemID="{C92DB59C-A80D-4402-A564-50EA110A9AE6}">
+  <ds:schemaRefs>
+    <ds:schemaRef ds:uri="http://schemas.microsoft.com/sharepoint/v3/contenttype/forms"/>
+  </ds:schemaRefs>
+</ds:datastoreItem>
 </file>
</xml_diff>